<commit_message>
fixed proper_service_content.docx and default_options_step.subject
</commit_message>
<xml_diff>
--- a/docassemble/AKA2JBranding/data/templates/proper_service_content.docx
+++ b/docassemble/AKA2JBranding/data/templates/proper_service_content.docx
@@ -7,208 +7,39 @@
         <w:pStyle w:val="Body"/>
       </w:pPr>
       <w:r>
+        <w:rPr>
+          <w:color w:val="FF0000"/>
+        </w:rPr>
         <w:t>{</w:t>
       </w:r>
       <w:r>
-        <w:t xml:space="preserve">% </w:t>
-      </w:r>
-      <w:r>
-        <w:rPr>
-          <w:color w:val="4B69C6"/>
-        </w:rPr>
-        <w:t>if</w:t>
-      </w:r>
-      <w:r>
-        <w:t xml:space="preserve"> </w:t>
-      </w:r>
-      <w:r>
-        <w:rPr>
-          <w:color w:val="777777"/>
-        </w:rPr>
-        <w:t>(</w:t>
-      </w:r>
-      <w:r>
-        <w:rPr>
-          <w:color w:val="7A3E9D"/>
-        </w:rPr>
-        <w:t>type_of_response</w:t>
-      </w:r>
-      <w:r>
-        <w:rPr>
-          <w:color w:val="777777"/>
-        </w:rPr>
-        <w:t>['</w:t>
-      </w:r>
-      <w:r>
-        <w:rPr>
-          <w:color w:val="448C27"/>
-        </w:rPr>
-        <w:t>improper service</w:t>
-      </w:r>
-      <w:r>
-        <w:rPr>
-          <w:color w:val="777777"/>
-        </w:rPr>
-        <w:t>']</w:t>
-      </w:r>
-      <w:r>
-        <w:t xml:space="preserve"> </w:t>
-      </w:r>
-      <w:r>
-        <w:rPr>
-          <w:color w:val="4B69C6"/>
-        </w:rPr>
-        <w:t>and</w:t>
-      </w:r>
-      <w:r>
-        <w:t xml:space="preserve"> </w:t>
-      </w:r>
-      <w:r>
-        <w:rPr>
-          <w:color w:val="4B69C6"/>
-        </w:rPr>
-        <w:t>not</w:t>
-      </w:r>
-      <w:r>
-        <w:t xml:space="preserve"> </w:t>
-      </w:r>
-      <w:r>
-        <w:rPr>
-          <w:color w:val="7A3E9D"/>
-        </w:rPr>
-        <w:t>type_of_response</w:t>
-      </w:r>
-      <w:r>
-        <w:rPr>
-          <w:color w:val="777777"/>
-        </w:rPr>
-        <w:t>['</w:t>
-      </w:r>
-      <w:r>
-        <w:rPr>
-          <w:color w:val="448C27"/>
-        </w:rPr>
-        <w:t>default</w:t>
-      </w:r>
-      <w:r>
-        <w:rPr>
-          <w:color w:val="777777"/>
-        </w:rPr>
-        <w:t>'])</w:t>
-      </w:r>
-      <w:r>
-        <w:t xml:space="preserve"> </w:t>
-      </w:r>
-      <w:r>
-        <w:rPr>
-          <w:color w:val="4B69C6"/>
-        </w:rPr>
-        <w:t>or</w:t>
-      </w:r>
-      <w:r>
-        <w:t xml:space="preserve"> </w:t>
-      </w:r>
-      <w:r>
-        <w:rPr>
-          <w:color w:val="777777"/>
-        </w:rPr>
-        <w:t>(</w:t>
-      </w:r>
-      <w:r>
-        <w:rPr>
-          <w:color w:val="7A3E9D"/>
-        </w:rPr>
-        <w:t>type_of_response</w:t>
-      </w:r>
-      <w:r>
-        <w:rPr>
-          <w:color w:val="777777"/>
-        </w:rPr>
-        <w:t>['</w:t>
-      </w:r>
-      <w:r>
-        <w:rPr>
-          <w:color w:val="448C27"/>
-        </w:rPr>
-        <w:t>default</w:t>
-      </w:r>
-      <w:r>
-        <w:rPr>
-          <w:color w:val="777777"/>
-        </w:rPr>
-        <w:t>']</w:t>
-      </w:r>
-      <w:r>
-        <w:t xml:space="preserve"> </w:t>
-      </w:r>
-      <w:r>
-        <w:rPr>
-          <w:color w:val="4B69C6"/>
-        </w:rPr>
-        <w:t>and</w:t>
-      </w:r>
-      <w:r>
-        <w:t xml:space="preserve"> </w:t>
-      </w:r>
-      <w:r>
-        <w:rPr>
-          <w:color w:val="4B69C6"/>
-        </w:rPr>
-        <w:t>not</w:t>
-      </w:r>
-      <w:r>
-        <w:t xml:space="preserve"> </w:t>
-      </w:r>
-      <w:r>
-        <w:rPr>
-          <w:color w:val="7A3E9D"/>
-        </w:rPr>
-        <w:t>proper_service</w:t>
-      </w:r>
-      <w:r>
-        <w:rPr>
-          <w:color w:val="777777"/>
-        </w:rPr>
-        <w:t>)</w:t>
-      </w:r>
-      <w:r>
-        <w:t xml:space="preserve"> %}{{ </w:t>
-      </w:r>
-      <w:r>
-        <w:rPr>
-          <w:color w:val="7A3E9D"/>
-        </w:rPr>
-        <w:t>capitalize</w:t>
-      </w:r>
-      <w:r>
-        <w:rPr>
-          <w:color w:val="777777"/>
-        </w:rPr>
-        <w:t>(</w:t>
-      </w:r>
-      <w:r>
-        <w:rPr>
-          <w:color w:val="7A3E9D"/>
-        </w:rPr>
-        <w:t>other_party_in_case</w:t>
-      </w:r>
-      <w:r>
-        <w:rPr>
-          <w:color w:val="777777"/>
-        </w:rPr>
-        <w:t>)</w:t>
-      </w:r>
-      <w:r>
-        <w:t xml:space="preserve"> }} started a {{ </w:t>
-      </w:r>
-      <w:r>
-        <w:rPr>
-          <w:color w:val="7A3E9D"/>
-        </w:rPr>
-        <w:t>case_type</w:t>
-      </w:r>
-      <w:r>
-        <w:t xml:space="preserve"> }} case by filing documents with the court. They were supposed to give you a copy of the documents they filed one of these ways:</w:t>
+        <w:rPr>
+          <w:color w:val="FF0000"/>
+        </w:rPr>
+        <w:t>%</w:t>
+      </w:r>
+      <w:r>
+        <w:rPr>
+          <w:color w:val="FF0000"/>
+        </w:rPr>
+        <w:t>p</w:t>
+      </w:r>
+      <w:r>
+        <w:rPr>
+          <w:color w:val="FF0000"/>
+        </w:rPr>
+        <w:t xml:space="preserve"> if (type_of_response['improper service'] and not type_of_response['default']) or (type_of_response['default'] and not proper_service) %}</w:t>
+      </w:r>
+    </w:p>
+    <w:p>
+      <w:pPr>
+        <w:pStyle w:val="Body"/>
+      </w:pPr>
+      <w:r>
+        <w:t>{{ capitalize(other_party_in_case) }} started a {{ case_type }}</w:t>
+      </w:r>
+      <w:r>
+        <w:t xml:space="preserve"> case by filing documents with the court. They were supposed to give you a copy of the documents they filed one of these ways:</w:t>
       </w:r>
     </w:p>
     <w:p>
@@ -248,118 +79,22 @@
         <w:pStyle w:val="Body"/>
       </w:pPr>
       <w:r>
-        <w:t xml:space="preserve">{% </w:t>
-      </w:r>
-      <w:r>
-        <w:rPr>
-          <w:color w:val="4B69C6"/>
-        </w:rPr>
-        <w:t>if</w:t>
-      </w:r>
-      <w:r>
-        <w:t xml:space="preserve"> </w:t>
-      </w:r>
-      <w:r>
-        <w:rPr>
-          <w:color w:val="7A3E9D"/>
-        </w:rPr>
-        <w:t>type_of_response</w:t>
-      </w:r>
-      <w:r>
-        <w:rPr>
-          <w:color w:val="777777"/>
-        </w:rPr>
-        <w:t>['</w:t>
-      </w:r>
-      <w:r>
-        <w:rPr>
-          <w:color w:val="448C27"/>
-        </w:rPr>
-        <w:t>case in 2 states</w:t>
-      </w:r>
-      <w:r>
-        <w:rPr>
-          <w:color w:val="777777"/>
-        </w:rPr>
-        <w:t>']</w:t>
-      </w:r>
-      <w:r>
-        <w:t xml:space="preserve"> </w:t>
-      </w:r>
-      <w:r>
-        <w:rPr>
-          <w:color w:val="4B69C6"/>
-        </w:rPr>
-        <w:t>and</w:t>
-      </w:r>
-      <w:r>
-        <w:t xml:space="preserve"> </w:t>
-      </w:r>
-      <w:r>
-        <w:rPr>
-          <w:color w:val="7A3E9D"/>
-        </w:rPr>
-        <w:t>stage_of_other_case</w:t>
-      </w:r>
-      <w:r>
-        <w:t xml:space="preserve"> </w:t>
-      </w:r>
-      <w:r>
-        <w:rPr>
-          <w:color w:val="777777"/>
-        </w:rPr>
-        <w:t>==</w:t>
-      </w:r>
-      <w:r>
-        <w:t xml:space="preserve"> </w:t>
-      </w:r>
-      <w:r>
-        <w:rPr>
-          <w:color w:val="777777"/>
-        </w:rPr>
-        <w:t>'</w:t>
-      </w:r>
-      <w:r>
-        <w:rPr>
-          <w:color w:val="448C27"/>
-        </w:rPr>
-        <w:t>ended with order</w:t>
-      </w:r>
-      <w:r>
-        <w:rPr>
-          <w:color w:val="777777"/>
-        </w:rPr>
-        <w:t>'</w:t>
-      </w:r>
-      <w:r>
-        <w:t xml:space="preserve"> %}After you are served, you have </w:t>
-      </w:r>
-      <w:r>
-        <w:rPr>
-          <w:b/>
-        </w:rPr>
-        <w:t>20</w:t>
-      </w:r>
-      <w:r>
-        <w:t xml:space="preserve"> days to file a response.{% </w:t>
-      </w:r>
-      <w:r>
-        <w:rPr>
-          <w:color w:val="4B69C6"/>
-        </w:rPr>
-        <w:t>else</w:t>
-      </w:r>
-      <w:r>
-        <w:t xml:space="preserve"> %}After you are served, you have </w:t>
-      </w:r>
-      <w:r>
-        <w:rPr>
-          <w:b/>
-        </w:rPr>
-        <w:t>20</w:t>
-      </w:r>
-      <w:r>
-        <w:t xml:space="preserve"> days to file an Answer.</w:t>
+        <w:rPr>
+          <w:color w:val="FFC000"/>
+        </w:rPr>
+        <w:t>{%</w:t>
+      </w:r>
+      <w:r>
+        <w:rPr>
+          <w:color w:val="FFC000"/>
+        </w:rPr>
+        <w:t>p</w:t>
+      </w:r>
+      <w:r>
+        <w:rPr>
+          <w:color w:val="FFC000"/>
+        </w:rPr>
+        <w:t xml:space="preserve"> if type_of_response['case in 2 states'] and stage_of_other_case == 'ended with order' %}</w:t>
       </w:r>
     </w:p>
     <w:p>
@@ -367,231 +102,39 @@
         <w:pStyle w:val="Body"/>
       </w:pPr>
       <w:r>
-        <w:t xml:space="preserve">If you do not file an Answer in 20 days, {{ </w:t>
-      </w:r>
-      <w:r>
-        <w:rPr>
-          <w:color w:val="7A3E9D"/>
-        </w:rPr>
-        <w:t>other_party_in_case</w:t>
-      </w:r>
-      <w:r>
-        <w:t xml:space="preserve"> }} may ask the court for a default judgment.{% </w:t>
-      </w:r>
-      <w:r>
-        <w:rPr>
-          <w:color w:val="4B69C6"/>
-        </w:rPr>
-        <w:t>endif</w:t>
-      </w:r>
-      <w:r>
-        <w:t xml:space="preserve"> %}{% </w:t>
-      </w:r>
-      <w:r>
-        <w:rPr>
-          <w:color w:val="4B69C6"/>
-        </w:rPr>
-        <w:t>endif</w:t>
-      </w:r>
-      <w:r>
-        <w:t xml:space="preserve"> %}{% </w:t>
-      </w:r>
-      <w:r>
-        <w:rPr>
-          <w:color w:val="4B69C6"/>
-        </w:rPr>
-        <w:t>if</w:t>
-      </w:r>
-      <w:r>
-        <w:t xml:space="preserve"> </w:t>
-      </w:r>
-      <w:r>
-        <w:rPr>
-          <w:color w:val="7A3E9D"/>
-        </w:rPr>
-        <w:t>type_of_response</w:t>
-      </w:r>
-      <w:r>
-        <w:rPr>
-          <w:color w:val="777777"/>
-        </w:rPr>
-        <w:t>.</w:t>
-      </w:r>
-      <w:r>
-        <w:rPr>
-          <w:color w:val="7A3E9D"/>
-        </w:rPr>
-        <w:t>all_true</w:t>
-      </w:r>
-      <w:r>
-        <w:rPr>
-          <w:color w:val="777777"/>
-        </w:rPr>
-        <w:t>('</w:t>
-      </w:r>
-      <w:r>
-        <w:rPr>
-          <w:color w:val="448C27"/>
-        </w:rPr>
-        <w:t>improper service</w:t>
-      </w:r>
-      <w:r>
-        <w:rPr>
-          <w:color w:val="777777"/>
-        </w:rPr>
-        <w:t>',</w:t>
-      </w:r>
-      <w:r>
-        <w:t xml:space="preserve"> </w:t>
-      </w:r>
-      <w:r>
-        <w:rPr>
-          <w:color w:val="7A3E9D"/>
-        </w:rPr>
-        <w:t>exclusive</w:t>
-      </w:r>
-      <w:r>
-        <w:t xml:space="preserve"> </w:t>
-      </w:r>
-      <w:r>
-        <w:rPr>
-          <w:color w:val="777777"/>
-        </w:rPr>
-        <w:t>=</w:t>
-      </w:r>
-      <w:r>
-        <w:t xml:space="preserve"> </w:t>
-      </w:r>
-      <w:r>
-        <w:rPr>
-          <w:color w:val="7A3E9D"/>
-        </w:rPr>
-        <w:t>True</w:t>
-      </w:r>
-      <w:r>
-        <w:rPr>
-          <w:color w:val="777777"/>
-        </w:rPr>
-        <w:t>)</w:t>
-      </w:r>
-      <w:r>
-        <w:t xml:space="preserve"> </w:t>
-      </w:r>
-      <w:r>
-        <w:rPr>
-          <w:color w:val="4B69C6"/>
-        </w:rPr>
-        <w:t>or</w:t>
-      </w:r>
-      <w:r>
-        <w:t xml:space="preserve"> </w:t>
-      </w:r>
-      <w:r>
-        <w:rPr>
-          <w:color w:val="777777"/>
-        </w:rPr>
-        <w:t>(</w:t>
-      </w:r>
-      <w:r>
-        <w:rPr>
-          <w:color w:val="7A3E9D"/>
-        </w:rPr>
-        <w:t>type_of_response</w:t>
-      </w:r>
-      <w:r>
-        <w:rPr>
-          <w:color w:val="777777"/>
-        </w:rPr>
-        <w:t>.</w:t>
-      </w:r>
-      <w:r>
-        <w:rPr>
-          <w:color w:val="7A3E9D"/>
-        </w:rPr>
-        <w:t>any_true</w:t>
-      </w:r>
-      <w:r>
-        <w:rPr>
-          <w:color w:val="777777"/>
-        </w:rPr>
-        <w:t>('</w:t>
-      </w:r>
-      <w:r>
-        <w:rPr>
-          <w:color w:val="448C27"/>
-        </w:rPr>
-        <w:t>improper service</w:t>
-      </w:r>
-      <w:r>
-        <w:rPr>
-          <w:color w:val="777777"/>
-        </w:rPr>
-        <w:t>',</w:t>
-      </w:r>
-      <w:r>
-        <w:t xml:space="preserve"> </w:t>
-      </w:r>
-      <w:r>
-        <w:rPr>
-          <w:color w:val="777777"/>
-        </w:rPr>
-        <w:t>'</w:t>
-      </w:r>
-      <w:r>
-        <w:rPr>
-          <w:color w:val="448C27"/>
-        </w:rPr>
-        <w:t>default</w:t>
-      </w:r>
-      <w:r>
-        <w:rPr>
-          <w:color w:val="777777"/>
-        </w:rPr>
-        <w:t>')</w:t>
-      </w:r>
-      <w:r>
-        <w:t xml:space="preserve"> </w:t>
-      </w:r>
-      <w:r>
-        <w:rPr>
-          <w:color w:val="4B69C6"/>
-        </w:rPr>
-        <w:t>and</w:t>
-      </w:r>
-      <w:r>
-        <w:t xml:space="preserve"> </w:t>
-      </w:r>
-      <w:r>
-        <w:rPr>
-          <w:color w:val="4B69C6"/>
-        </w:rPr>
-        <w:t>not</w:t>
-      </w:r>
-      <w:r>
-        <w:t xml:space="preserve"> </w:t>
-      </w:r>
-      <w:r>
-        <w:rPr>
-          <w:color w:val="7A3E9D"/>
-        </w:rPr>
-        <w:t>proper_service</w:t>
-      </w:r>
-      <w:r>
-        <w:rPr>
-          <w:color w:val="777777"/>
-        </w:rPr>
-        <w:t>)</w:t>
-      </w:r>
-      <w:r>
-        <w:t xml:space="preserve"> %}</w:t>
+        <w:t xml:space="preserve">After you are served, you have </w:t>
+      </w:r>
+      <w:r>
+        <w:rPr>
+          <w:b/>
+        </w:rPr>
+        <w:t>20</w:t>
+      </w:r>
+      <w:r>
+        <w:t xml:space="preserve"> days to file a response.</w:t>
       </w:r>
     </w:p>
     <w:p>
       <w:pPr>
-        <w:pStyle w:val="Heading3"/>
-      </w:pPr>
-      <w:r>
-        <w:t>Default judgment</w:t>
+        <w:pStyle w:val="Body"/>
+      </w:pPr>
+      <w:r>
+        <w:rPr>
+          <w:color w:val="FFC000"/>
+        </w:rPr>
+        <w:t>{%</w:t>
+      </w:r>
+      <w:r>
+        <w:rPr>
+          <w:color w:val="FFC000"/>
+        </w:rPr>
+        <w:t>p</w:t>
+      </w:r>
+      <w:r>
+        <w:rPr>
+          <w:color w:val="FFC000"/>
+        </w:rPr>
+        <w:t xml:space="preserve"> else %}</w:t>
       </w:r>
     </w:p>
     <w:p>
@@ -599,16 +142,16 @@
         <w:pStyle w:val="Body"/>
       </w:pPr>
       <w:r>
-        <w:t xml:space="preserve">{% </w:t>
-      </w:r>
-      <w:r>
-        <w:rPr>
-          <w:color w:val="4B69C6"/>
-        </w:rPr>
-        <w:t>endif</w:t>
-      </w:r>
-      <w:r>
-        <w:t xml:space="preserve"> %}A default judgment is when the judge decides your case without hearing from you.</w:t>
+        <w:t xml:space="preserve">After you are served, you have </w:t>
+      </w:r>
+      <w:r>
+        <w:rPr>
+          <w:b/>
+        </w:rPr>
+        <w:t>20</w:t>
+      </w:r>
+      <w:r>
+        <w:t xml:space="preserve"> days to file an Answer.</w:t>
       </w:r>
     </w:p>
     <w:p>
@@ -616,355 +159,155 @@
         <w:pStyle w:val="Body"/>
       </w:pPr>
       <w:r>
-        <w:t xml:space="preserve">{% </w:t>
-      </w:r>
-      <w:r>
-        <w:rPr>
-          <w:color w:val="4B69C6"/>
-        </w:rPr>
-        <w:t>if</w:t>
-      </w:r>
-      <w:r>
-        <w:t xml:space="preserve"> </w:t>
-      </w:r>
-      <w:r>
-        <w:rPr>
-          <w:color w:val="7A3E9D"/>
-        </w:rPr>
-        <w:t>type_of_response</w:t>
-      </w:r>
-      <w:r>
-        <w:rPr>
-          <w:color w:val="777777"/>
-        </w:rPr>
-        <w:t>.</w:t>
-      </w:r>
-      <w:r>
-        <w:rPr>
-          <w:color w:val="7A3E9D"/>
-        </w:rPr>
-        <w:t>all_true</w:t>
-      </w:r>
-      <w:r>
-        <w:rPr>
-          <w:color w:val="777777"/>
-        </w:rPr>
-        <w:t>('</w:t>
-      </w:r>
-      <w:r>
-        <w:rPr>
-          <w:color w:val="448C27"/>
-        </w:rPr>
-        <w:t>improper service</w:t>
-      </w:r>
-      <w:r>
-        <w:rPr>
-          <w:color w:val="777777"/>
-        </w:rPr>
-        <w:t>',</w:t>
-      </w:r>
-      <w:r>
-        <w:t xml:space="preserve"> </w:t>
-      </w:r>
-      <w:r>
-        <w:rPr>
-          <w:color w:val="7A3E9D"/>
-        </w:rPr>
-        <w:t>exclusive</w:t>
-      </w:r>
-      <w:r>
-        <w:t xml:space="preserve"> </w:t>
-      </w:r>
-      <w:r>
-        <w:rPr>
-          <w:color w:val="777777"/>
-        </w:rPr>
-        <w:t>=</w:t>
-      </w:r>
-      <w:r>
-        <w:t xml:space="preserve"> </w:t>
-      </w:r>
-      <w:r>
-        <w:rPr>
-          <w:color w:val="7A3E9D"/>
-        </w:rPr>
-        <w:t>True</w:t>
-      </w:r>
-      <w:r>
-        <w:rPr>
-          <w:color w:val="777777"/>
-        </w:rPr>
-        <w:t>)</w:t>
-      </w:r>
-      <w:r>
-        <w:t xml:space="preserve"> </w:t>
-      </w:r>
-      <w:r>
-        <w:rPr>
-          <w:color w:val="4B69C6"/>
-        </w:rPr>
-        <w:t>or</w:t>
-      </w:r>
-      <w:r>
-        <w:t xml:space="preserve"> </w:t>
-      </w:r>
-      <w:r>
-        <w:rPr>
-          <w:color w:val="777777"/>
-        </w:rPr>
-        <w:t>(</w:t>
-      </w:r>
-      <w:r>
-        <w:rPr>
-          <w:color w:val="7A3E9D"/>
-        </w:rPr>
-        <w:t>type_of_response</w:t>
-      </w:r>
-      <w:r>
-        <w:rPr>
-          <w:color w:val="777777"/>
-        </w:rPr>
-        <w:t>.</w:t>
-      </w:r>
-      <w:r>
-        <w:rPr>
-          <w:color w:val="7A3E9D"/>
-        </w:rPr>
-        <w:t>all_false</w:t>
-      </w:r>
-      <w:r>
-        <w:rPr>
-          <w:color w:val="777777"/>
-        </w:rPr>
-        <w:t>('</w:t>
-      </w:r>
-      <w:r>
-        <w:rPr>
-          <w:color w:val="448C27"/>
-        </w:rPr>
-        <w:t>default</w:t>
-      </w:r>
-      <w:r>
-        <w:rPr>
-          <w:color w:val="777777"/>
-        </w:rPr>
-        <w:t>')</w:t>
-      </w:r>
-      <w:r>
-        <w:t xml:space="preserve"> </w:t>
-      </w:r>
-      <w:r>
-        <w:rPr>
-          <w:color w:val="4B69C6"/>
-        </w:rPr>
-        <w:t>and</w:t>
-      </w:r>
-      <w:r>
-        <w:t xml:space="preserve"> </w:t>
-      </w:r>
-      <w:r>
-        <w:rPr>
-          <w:color w:val="7A3E9D"/>
-        </w:rPr>
-        <w:t>type_of_response</w:t>
-      </w:r>
-      <w:r>
-        <w:rPr>
-          <w:color w:val="777777"/>
-        </w:rPr>
-        <w:t>['</w:t>
-      </w:r>
-      <w:r>
-        <w:rPr>
-          <w:color w:val="448C27"/>
-        </w:rPr>
-        <w:t>improper service</w:t>
-      </w:r>
-      <w:r>
-        <w:rPr>
-          <w:color w:val="777777"/>
-        </w:rPr>
-        <w:t>']</w:t>
-      </w:r>
-      <w:r>
-        <w:t xml:space="preserve"> </w:t>
-      </w:r>
-      <w:r>
-        <w:rPr>
-          <w:color w:val="4B69C6"/>
-        </w:rPr>
-        <w:t>and</w:t>
-      </w:r>
-      <w:r>
-        <w:t xml:space="preserve"> </w:t>
-      </w:r>
-      <w:r>
-        <w:rPr>
-          <w:color w:val="4B69C6"/>
-        </w:rPr>
-        <w:t>not</w:t>
-      </w:r>
-      <w:r>
-        <w:t xml:space="preserve"> </w:t>
-      </w:r>
-      <w:r>
-        <w:rPr>
-          <w:color w:val="7A3E9D"/>
-        </w:rPr>
-        <w:t>proper_service</w:t>
-      </w:r>
-      <w:r>
-        <w:rPr>
-          <w:color w:val="777777"/>
-        </w:rPr>
-        <w:t>)</w:t>
-      </w:r>
-      <w:r>
-        <w:t xml:space="preserve"> %} If {{ </w:t>
-      </w:r>
-      <w:r>
-        <w:rPr>
-          <w:color w:val="7A3E9D"/>
-        </w:rPr>
-        <w:t>other_party_in_case</w:t>
-      </w:r>
-      <w:r>
-        <w:t xml:space="preserve"> }} thinks they served you correctly, they may ask the court for a default judgment if you do not file {{ </w:t>
-      </w:r>
-      <w:r>
-        <w:rPr>
-          <w:color w:val="777777"/>
-        </w:rPr>
-        <w:t>"</w:t>
-      </w:r>
-      <w:r>
-        <w:rPr>
-          <w:color w:val="448C27"/>
-        </w:rPr>
-        <w:t>a response</w:t>
-      </w:r>
-      <w:r>
-        <w:rPr>
-          <w:color w:val="777777"/>
-        </w:rPr>
-        <w:t>"</w:t>
-      </w:r>
-      <w:r>
-        <w:t xml:space="preserve"> </w:t>
-      </w:r>
-      <w:r>
-        <w:rPr>
-          <w:color w:val="4B69C6"/>
-        </w:rPr>
-        <w:t>if</w:t>
-      </w:r>
-      <w:r>
-        <w:t xml:space="preserve"> </w:t>
-      </w:r>
-      <w:r>
-        <w:rPr>
-          <w:color w:val="7A3E9D"/>
-        </w:rPr>
-        <w:t>type_of_response</w:t>
-      </w:r>
-      <w:r>
-        <w:rPr>
-          <w:color w:val="777777"/>
-        </w:rPr>
-        <w:t>['</w:t>
-      </w:r>
-      <w:r>
-        <w:rPr>
-          <w:color w:val="448C27"/>
-        </w:rPr>
-        <w:t>case in 2 states</w:t>
-      </w:r>
-      <w:r>
-        <w:rPr>
-          <w:color w:val="777777"/>
-        </w:rPr>
-        <w:t>']</w:t>
-      </w:r>
-      <w:r>
-        <w:t xml:space="preserve"> </w:t>
-      </w:r>
-      <w:r>
-        <w:rPr>
-          <w:color w:val="4B69C6"/>
-        </w:rPr>
-        <w:t>and</w:t>
-      </w:r>
-      <w:r>
-        <w:t xml:space="preserve"> </w:t>
-      </w:r>
-      <w:r>
-        <w:rPr>
-          <w:color w:val="7A3E9D"/>
-        </w:rPr>
-        <w:t>stage_of_other_case</w:t>
-      </w:r>
-      <w:r>
-        <w:t xml:space="preserve"> </w:t>
-      </w:r>
-      <w:r>
-        <w:rPr>
-          <w:color w:val="777777"/>
-        </w:rPr>
-        <w:t>==</w:t>
-      </w:r>
-      <w:r>
-        <w:t xml:space="preserve"> </w:t>
-      </w:r>
-      <w:r>
-        <w:rPr>
-          <w:color w:val="777777"/>
-        </w:rPr>
-        <w:t>'</w:t>
-      </w:r>
-      <w:r>
-        <w:rPr>
-          <w:color w:val="448C27"/>
-        </w:rPr>
-        <w:t>ended with order</w:t>
-      </w:r>
-      <w:r>
-        <w:rPr>
-          <w:color w:val="777777"/>
-        </w:rPr>
-        <w:t>'</w:t>
-      </w:r>
-      <w:r>
-        <w:t xml:space="preserve"> </w:t>
-      </w:r>
-      <w:r>
-        <w:rPr>
-          <w:color w:val="4B69C6"/>
-        </w:rPr>
-        <w:t>else</w:t>
-      </w:r>
-      <w:r>
-        <w:t xml:space="preserve"> </w:t>
-      </w:r>
-      <w:r>
-        <w:rPr>
-          <w:color w:val="777777"/>
-        </w:rPr>
-        <w:t>"</w:t>
-      </w:r>
-      <w:r>
-        <w:rPr>
-          <w:color w:val="448C27"/>
-        </w:rPr>
-        <w:t>an Answer</w:t>
-      </w:r>
-      <w:r>
-        <w:rPr>
-          <w:color w:val="777777"/>
-        </w:rPr>
-        <w:t>"</w:t>
-      </w:r>
-      <w:r>
-        <w:t xml:space="preserve"> }} in 20 days. They are supposed to give you a copy of the </w:t>
+        <w:t xml:space="preserve">If you do not file an Answer in 20 days, </w:t>
+      </w:r>
+      <w:r>
+        <w:t>{{ other_party_in_case }}</w:t>
+      </w:r>
+      <w:r>
+        <w:t xml:space="preserve"> may ask the court for a default judgment.</w:t>
+      </w:r>
+    </w:p>
+    <w:p>
+      <w:pPr>
+        <w:pStyle w:val="Body"/>
+      </w:pPr>
+      <w:r>
+        <w:rPr>
+          <w:color w:val="FFC000"/>
+        </w:rPr>
+        <w:t>{%</w:t>
+      </w:r>
+      <w:r>
+        <w:rPr>
+          <w:color w:val="FFC000"/>
+        </w:rPr>
+        <w:t>p</w:t>
+      </w:r>
+      <w:r>
+        <w:rPr>
+          <w:color w:val="FFC000"/>
+        </w:rPr>
+        <w:t xml:space="preserve"> endif %}</w:t>
+      </w:r>
+    </w:p>
+    <w:p>
+      <w:pPr>
+        <w:pStyle w:val="Body"/>
+      </w:pPr>
+      <w:r>
+        <w:rPr>
+          <w:color w:val="FF0000"/>
+        </w:rPr>
+        <w:t>{%</w:t>
+      </w:r>
+      <w:r>
+        <w:rPr>
+          <w:color w:val="FF0000"/>
+        </w:rPr>
+        <w:t>p</w:t>
+      </w:r>
+      <w:r>
+        <w:rPr>
+          <w:color w:val="FF0000"/>
+        </w:rPr>
+        <w:t xml:space="preserve"> endif %}</w:t>
+      </w:r>
+    </w:p>
+    <w:p>
+      <w:pPr>
+        <w:pStyle w:val="Body"/>
+      </w:pPr>
+      <w:r>
+        <w:rPr>
+          <w:color w:val="FF0000"/>
+        </w:rPr>
+        <w:t>{%</w:t>
+      </w:r>
+      <w:r>
+        <w:rPr>
+          <w:color w:val="FF0000"/>
+        </w:rPr>
+        <w:t>p</w:t>
+      </w:r>
+      <w:r>
+        <w:rPr>
+          <w:color w:val="FF0000"/>
+        </w:rPr>
+        <w:t xml:space="preserve"> if type_of_response.all_true('improper service', exclusive = True) or (type_of_response.any_true('improper service', 'default') and not proper_service) %}</w:t>
+      </w:r>
+    </w:p>
+    <w:p>
+      <w:pPr>
+        <w:pStyle w:val="Heading3"/>
+      </w:pPr>
+      <w:r>
+        <w:t>Default judgment</w:t>
+      </w:r>
+    </w:p>
+    <w:p>
+      <w:pPr>
+        <w:pStyle w:val="Body"/>
+      </w:pPr>
+      <w:r>
+        <w:rPr>
+          <w:color w:val="FF0000"/>
+        </w:rPr>
+        <w:t>{%</w:t>
+      </w:r>
+      <w:r>
+        <w:rPr>
+          <w:color w:val="FF0000"/>
+        </w:rPr>
+        <w:t>p</w:t>
+      </w:r>
+      <w:r>
+        <w:rPr>
+          <w:color w:val="FF0000"/>
+        </w:rPr>
+        <w:t xml:space="preserve"> endif %}</w:t>
+      </w:r>
+    </w:p>
+    <w:p>
+      <w:pPr>
+        <w:pStyle w:val="Body"/>
+      </w:pPr>
+      <w:r>
+        <w:t>A default judgment is when the judge decides your case without hearing from you.</w:t>
+      </w:r>
+    </w:p>
+    <w:p>
+      <w:pPr>
+        <w:pStyle w:val="Body"/>
+      </w:pPr>
+      <w:r>
+        <w:rPr>
+          <w:color w:val="FF0000"/>
+        </w:rPr>
+        <w:t>{%</w:t>
+      </w:r>
+      <w:r>
+        <w:rPr>
+          <w:color w:val="FF0000"/>
+        </w:rPr>
+        <w:t>p</w:t>
+      </w:r>
+      <w:r>
+        <w:rPr>
+          <w:color w:val="FF0000"/>
+        </w:rPr>
+        <w:t xml:space="preserve"> if type_of_response.all_true('improper service', exclusive = True) or (type_of_response.all_false('default') and type_of_response['improper service'] and not proper_service) %}</w:t>
+      </w:r>
+    </w:p>
+    <w:p>
+      <w:pPr>
+        <w:pStyle w:val="Body"/>
+      </w:pPr>
+      <w:r>
+        <w:t>If {{ other_party_in_case }} thinks they served you correctly, they may ask the court for a default judgment if you do not file {{ "a response" if type_of_response['case in 2 states'] and stage_of_other_case == 'ended with order' else "an Answer" }} in 20 days.</w:t>
+      </w:r>
+      <w:r>
+        <w:t xml:space="preserve"> They are supposed to give you a copy of the </w:t>
       </w:r>
       <w:r>
         <w:rPr>
@@ -977,16 +320,13 @@
         <w:t xml:space="preserve"> </w:t>
       </w:r>
       <w:r>
-        <w:t xml:space="preserve">if they file one with the court. If you want to make sure {{ </w:t>
-      </w:r>
-      <w:r>
-        <w:rPr>
-          <w:color w:val="7A3E9D"/>
-        </w:rPr>
-        <w:t>other_party_in_case</w:t>
-      </w:r>
-      <w:r>
-        <w:t xml:space="preserve"> }} has not filed for default, you can look up your case on </w:t>
+        <w:t xml:space="preserve">if they file one with the court. If you want to make sure </w:t>
+      </w:r>
+      <w:r>
+        <w:t>{{ other_party_in_case }}</w:t>
+      </w:r>
+      <w:r>
+        <w:t xml:space="preserve"> has not filed for default, you can look up your case on </w:t>
       </w:r>
       <w:hyperlink r:id="rId5" w:history="1">
         <w:r>
@@ -998,16 +338,7 @@
         </w:r>
       </w:hyperlink>
       <w:r>
-        <w:t xml:space="preserve">.{% </w:t>
-      </w:r>
-      <w:r>
-        <w:rPr>
-          <w:color w:val="4B69C6"/>
-        </w:rPr>
-        <w:t>endif</w:t>
-      </w:r>
-      <w:r>
-        <w:t xml:space="preserve"> %}</w:t>
+        <w:t>.</w:t>
       </w:r>
     </w:p>
     <w:p>
@@ -1015,148 +346,22 @@
         <w:pStyle w:val="Body"/>
       </w:pPr>
       <w:r>
-        <w:t xml:space="preserve">{% </w:t>
-      </w:r>
-      <w:r>
-        <w:rPr>
-          <w:color w:val="4B69C6"/>
-        </w:rPr>
-        <w:t>if</w:t>
-      </w:r>
-      <w:r>
-        <w:t xml:space="preserve"> </w:t>
-      </w:r>
-      <w:r>
-        <w:rPr>
-          <w:color w:val="7A3E9D"/>
-        </w:rPr>
-        <w:t>type_of_response</w:t>
-      </w:r>
-      <w:r>
-        <w:rPr>
-          <w:color w:val="777777"/>
-        </w:rPr>
-        <w:t>['</w:t>
-      </w:r>
-      <w:r>
-        <w:rPr>
-          <w:color w:val="448C27"/>
-        </w:rPr>
-        <w:t>default</w:t>
-      </w:r>
-      <w:r>
-        <w:rPr>
-          <w:color w:val="777777"/>
-        </w:rPr>
-        <w:t>']</w:t>
-      </w:r>
-      <w:r>
-        <w:t xml:space="preserve"> %}{% </w:t>
-      </w:r>
-      <w:r>
-        <w:rPr>
-          <w:color w:val="4B69C6"/>
-        </w:rPr>
-        <w:t>if</w:t>
-      </w:r>
-      <w:r>
-        <w:t xml:space="preserve"> </w:t>
-      </w:r>
-      <w:r>
-        <w:rPr>
-          <w:color w:val="7A3E9D"/>
-        </w:rPr>
-        <w:t>stage_of_default</w:t>
-      </w:r>
-      <w:r>
-        <w:t xml:space="preserve"> </w:t>
-      </w:r>
-      <w:r>
-        <w:rPr>
-          <w:color w:val="4B69C6"/>
-        </w:rPr>
-        <w:t>in</w:t>
-      </w:r>
-      <w:r>
-        <w:t xml:space="preserve"> </w:t>
-      </w:r>
-      <w:r>
-        <w:rPr>
-          <w:color w:val="777777"/>
-        </w:rPr>
-        <w:t>('</w:t>
-      </w:r>
-      <w:r>
-        <w:rPr>
-          <w:color w:val="448C27"/>
-        </w:rPr>
-        <w:t>application filed</w:t>
-      </w:r>
-      <w:r>
-        <w:rPr>
-          <w:color w:val="777777"/>
-        </w:rPr>
-        <w:t>',</w:t>
-      </w:r>
-      <w:r>
-        <w:t xml:space="preserve"> </w:t>
-      </w:r>
-      <w:r>
-        <w:rPr>
-          <w:color w:val="777777"/>
-        </w:rPr>
-        <w:t>'</w:t>
-      </w:r>
-      <w:r>
-        <w:rPr>
-          <w:color w:val="448C27"/>
-        </w:rPr>
-        <w:t>hearing scheduled</w:t>
-      </w:r>
-      <w:r>
-        <w:rPr>
-          <w:color w:val="777777"/>
-        </w:rPr>
-        <w:t>')</w:t>
-      </w:r>
-      <w:r>
-        <w:t xml:space="preserve"> %}If you do not file an Answer within 20 days of receiving the Complaint, {{ </w:t>
-      </w:r>
-      <w:r>
-        <w:rPr>
-          <w:color w:val="7A3E9D"/>
-        </w:rPr>
-        <w:t>other_party_in_case</w:t>
-      </w:r>
-      <w:r>
-        <w:t xml:space="preserve"> }} may ask the court for a default judgment.{% </w:t>
-      </w:r>
-      <w:r>
-        <w:rPr>
-          <w:color w:val="4B69C6"/>
-        </w:rPr>
-        <w:t>if</w:t>
-      </w:r>
-      <w:r>
-        <w:t xml:space="preserve"> </w:t>
-      </w:r>
-      <w:r>
-        <w:rPr>
-          <w:color w:val="4B69C6"/>
-        </w:rPr>
-        <w:t>not</w:t>
-      </w:r>
-      <w:r>
-        <w:t xml:space="preserve"> </w:t>
-      </w:r>
-      <w:r>
-        <w:rPr>
-          <w:color w:val="7A3E9D"/>
-        </w:rPr>
-        <w:t>proper_service</w:t>
-      </w:r>
-      <w:r>
-        <w:t xml:space="preserve"> %}</w:t>
+        <w:rPr>
+          <w:color w:val="FF0000"/>
+        </w:rPr>
+        <w:t>{%</w:t>
+      </w:r>
+      <w:r>
+        <w:rPr>
+          <w:color w:val="FF0000"/>
+        </w:rPr>
+        <w:t>p</w:t>
+      </w:r>
+      <w:r>
+        <w:rPr>
+          <w:color w:val="FF0000"/>
+        </w:rPr>
+        <w:t xml:space="preserve"> endif %}</w:t>
       </w:r>
     </w:p>
     <w:p>
@@ -1164,16 +369,88 @@
         <w:pStyle w:val="Body"/>
       </w:pPr>
       <w:r>
-        <w:t xml:space="preserve"> If you want to see what {{ </w:t>
-      </w:r>
-      <w:r>
-        <w:rPr>
-          <w:color w:val="7A3E9D"/>
-        </w:rPr>
-        <w:t>other_party_in_case</w:t>
-      </w:r>
-      <w:r>
-        <w:t xml:space="preserve"> }} filed for default, or if the judge entered any orders, you can look up your case on</w:t>
+        <w:rPr>
+          <w:color w:val="FF0000"/>
+        </w:rPr>
+        <w:lastRenderedPageBreak/>
+        <w:t>{%</w:t>
+      </w:r>
+      <w:r>
+        <w:rPr>
+          <w:color w:val="FF0000"/>
+        </w:rPr>
+        <w:t>p</w:t>
+      </w:r>
+      <w:r>
+        <w:rPr>
+          <w:color w:val="FF0000"/>
+        </w:rPr>
+        <w:t xml:space="preserve"> if type_of_response['default'] %}</w:t>
+      </w:r>
+    </w:p>
+    <w:p>
+      <w:pPr>
+        <w:pStyle w:val="Body"/>
+      </w:pPr>
+      <w:r>
+        <w:rPr>
+          <w:color w:val="FFC000"/>
+        </w:rPr>
+        <w:t>{%</w:t>
+      </w:r>
+      <w:r>
+        <w:rPr>
+          <w:color w:val="FFC000"/>
+        </w:rPr>
+        <w:t>p</w:t>
+      </w:r>
+      <w:r>
+        <w:rPr>
+          <w:color w:val="FFC000"/>
+        </w:rPr>
+        <w:t xml:space="preserve"> if stage_of_default in ('application filed', 'hearing scheduled') %}</w:t>
+      </w:r>
+    </w:p>
+    <w:p>
+      <w:pPr>
+        <w:pStyle w:val="Body"/>
+      </w:pPr>
+      <w:r>
+        <w:t>If you do not file an Answer within 20 days of receiving the Complaint, {{ other_party_in_case }} may ask the court for a default judgment.</w:t>
+      </w:r>
+    </w:p>
+    <w:p>
+      <w:pPr>
+        <w:pStyle w:val="Body"/>
+      </w:pPr>
+      <w:r>
+        <w:rPr>
+          <w:color w:val="92D050"/>
+        </w:rPr>
+        <w:t>{%</w:t>
+      </w:r>
+      <w:r>
+        <w:rPr>
+          <w:color w:val="92D050"/>
+        </w:rPr>
+        <w:t>p</w:t>
+      </w:r>
+      <w:r>
+        <w:rPr>
+          <w:color w:val="92D050"/>
+        </w:rPr>
+        <w:t xml:space="preserve"> if not proper_service %}</w:t>
+      </w:r>
+    </w:p>
+    <w:p>
+      <w:pPr>
+        <w:pStyle w:val="Body"/>
+      </w:pPr>
+      <w:r>
+        <w:t>If you want to see what {{ other_party_in_case }}</w:t>
+      </w:r>
+      <w:r>
+        <w:t xml:space="preserve"> filed for default, or if the judge entered any orders, you can look up your case on</w:t>
       </w:r>
       <w:r>
         <w:t xml:space="preserve"> </w:t>
@@ -1196,16 +473,22 @@
         <w:pStyle w:val="Body"/>
       </w:pPr>
       <w:r>
-        <w:t xml:space="preserve">{% </w:t>
-      </w:r>
-      <w:r>
-        <w:rPr>
-          <w:color w:val="4B69C6"/>
-        </w:rPr>
-        <w:t>endif</w:t>
-      </w:r>
-      <w:r>
-        <w:t xml:space="preserve"> %}</w:t>
+        <w:rPr>
+          <w:color w:val="92D050"/>
+        </w:rPr>
+        <w:t>{%</w:t>
+      </w:r>
+      <w:r>
+        <w:rPr>
+          <w:color w:val="92D050"/>
+        </w:rPr>
+        <w:t>p</w:t>
+      </w:r>
+      <w:r>
+        <w:rPr>
+          <w:color w:val="92D050"/>
+        </w:rPr>
+        <w:t xml:space="preserve"> endif %}</w:t>
       </w:r>
     </w:p>
     <w:p>
@@ -1213,7 +496,6 @@
         <w:pStyle w:val="Body"/>
       </w:pPr>
       <w:r>
-        <w:lastRenderedPageBreak/>
         <w:t>There are 3 steps to get a default judgment:</w:t>
       </w:r>
     </w:p>
@@ -1222,13 +504,10 @@
         <w:pStyle w:val="Body"/>
       </w:pPr>
       <w:r>
-        <w:t xml:space="preserve">1. {{ </w:t>
-      </w:r>
-      <w:r>
-        <w:rPr>
-          <w:color w:val="7A3E9D"/>
-        </w:rPr>
-        <w:t>other_party_in_case</w:t>
+        <w:t xml:space="preserve">1. </w:t>
+      </w:r>
+      <w:r>
+        <w:t>{{ other_party_in_case</w:t>
       </w:r>
       <w:r>
         <w:t xml:space="preserve"> }} files a </w:t>
@@ -1274,373 +553,13 @@
         <w:t>Default Hearing</w:t>
       </w:r>
       <w:r>
-        <w:t xml:space="preserve">. The judge may end your case without hearing from you and enter a default judgment order and other orders like a {{ </w:t>
-      </w:r>
-      <w:r>
-        <w:rPr>
-          <w:color w:val="777777"/>
-        </w:rPr>
-        <w:t>"</w:t>
-      </w:r>
-      <w:r>
-        <w:rPr>
-          <w:color w:val="448C27"/>
-        </w:rPr>
-        <w:t>custody decree, Parenting Plan, and child support order</w:t>
-      </w:r>
-      <w:r>
-        <w:rPr>
-          <w:color w:val="777777"/>
-        </w:rPr>
-        <w:t>"</w:t>
-      </w:r>
-      <w:r>
-        <w:t xml:space="preserve"> </w:t>
-      </w:r>
-      <w:r>
-        <w:rPr>
-          <w:color w:val="4B69C6"/>
-        </w:rPr>
-        <w:t>if</w:t>
-      </w:r>
-      <w:r>
-        <w:t xml:space="preserve"> </w:t>
-      </w:r>
-      <w:r>
-        <w:rPr>
-          <w:color w:val="7A3E9D"/>
-        </w:rPr>
-        <w:t>user_need</w:t>
-      </w:r>
-      <w:r>
-        <w:t xml:space="preserve"> </w:t>
-      </w:r>
-      <w:r>
-        <w:rPr>
-          <w:color w:val="777777"/>
-        </w:rPr>
-        <w:t>==</w:t>
-      </w:r>
-      <w:r>
-        <w:t xml:space="preserve"> </w:t>
-      </w:r>
-      <w:r>
-        <w:rPr>
-          <w:color w:val="777777"/>
-        </w:rPr>
-        <w:t>'</w:t>
-      </w:r>
-      <w:r>
-        <w:rPr>
-          <w:color w:val="448C27"/>
-        </w:rPr>
-        <w:t>answer custody</w:t>
-      </w:r>
-      <w:r>
-        <w:rPr>
-          <w:color w:val="777777"/>
-        </w:rPr>
-        <w:t>'</w:t>
-      </w:r>
-      <w:r>
-        <w:t xml:space="preserve"> </w:t>
-      </w:r>
-      <w:r>
-        <w:rPr>
-          <w:color w:val="4B69C6"/>
-        </w:rPr>
-        <w:t>else</w:t>
-      </w:r>
-      <w:r>
-        <w:t xml:space="preserve"> </w:t>
-      </w:r>
-      <w:r>
-        <w:rPr>
-          <w:color w:val="777777"/>
-        </w:rPr>
-        <w:t>""</w:t>
-      </w:r>
-      <w:r>
-        <w:t xml:space="preserve"> }}{{ </w:t>
-      </w:r>
-      <w:r>
-        <w:rPr>
-          <w:color w:val="777777"/>
-        </w:rPr>
-        <w:t>"</w:t>
-      </w:r>
-      <w:r>
-        <w:rPr>
-          <w:color w:val="448C27"/>
-        </w:rPr>
-        <w:t>divorce decree and findings of fact and conclusions of law dividing your property and debt</w:t>
-      </w:r>
-      <w:r>
-        <w:rPr>
-          <w:color w:val="777777"/>
-        </w:rPr>
-        <w:t>"</w:t>
-      </w:r>
-      <w:r>
-        <w:t xml:space="preserve"> </w:t>
-      </w:r>
-      <w:r>
-        <w:rPr>
-          <w:color w:val="4B69C6"/>
-        </w:rPr>
-        <w:t>if</w:t>
-      </w:r>
-      <w:r>
-        <w:t xml:space="preserve"> </w:t>
-      </w:r>
-      <w:r>
-        <w:rPr>
-          <w:color w:val="7A3E9D"/>
-        </w:rPr>
-        <w:t>user_need</w:t>
-      </w:r>
-      <w:r>
-        <w:t xml:space="preserve"> </w:t>
-      </w:r>
-      <w:r>
-        <w:rPr>
-          <w:color w:val="777777"/>
-        </w:rPr>
-        <w:t>==</w:t>
-      </w:r>
-      <w:r>
-        <w:t xml:space="preserve"> </w:t>
-      </w:r>
-      <w:r>
-        <w:rPr>
-          <w:color w:val="777777"/>
-        </w:rPr>
-        <w:t>'</w:t>
-      </w:r>
-      <w:r>
-        <w:rPr>
-          <w:color w:val="448C27"/>
-        </w:rPr>
-        <w:t>answer divorce</w:t>
-      </w:r>
-      <w:r>
-        <w:rPr>
-          <w:color w:val="777777"/>
-        </w:rPr>
-        <w:t>'</w:t>
-      </w:r>
-      <w:r>
-        <w:t xml:space="preserve"> </w:t>
-      </w:r>
-      <w:r>
-        <w:rPr>
-          <w:color w:val="4B69C6"/>
-        </w:rPr>
-        <w:t>else</w:t>
-      </w:r>
-      <w:r>
-        <w:t xml:space="preserve"> </w:t>
-      </w:r>
-      <w:r>
-        <w:rPr>
-          <w:color w:val="777777"/>
-        </w:rPr>
-        <w:t>""</w:t>
-      </w:r>
-      <w:r>
-        <w:t xml:space="preserve"> }}{{ </w:t>
-      </w:r>
-      <w:r>
-        <w:rPr>
-          <w:color w:val="777777"/>
-        </w:rPr>
-        <w:t>"</w:t>
-      </w:r>
-      <w:r>
-        <w:rPr>
-          <w:color w:val="448C27"/>
-        </w:rPr>
-        <w:t>, Parenting Plan, and child support order</w:t>
-      </w:r>
-      <w:r>
-        <w:rPr>
-          <w:color w:val="777777"/>
-        </w:rPr>
-        <w:t>"</w:t>
-      </w:r>
-      <w:r>
-        <w:t xml:space="preserve"> </w:t>
-      </w:r>
-      <w:r>
-        <w:rPr>
-          <w:color w:val="4B69C6"/>
-        </w:rPr>
-        <w:t>if</w:t>
-      </w:r>
-      <w:r>
-        <w:t xml:space="preserve"> </w:t>
-      </w:r>
-      <w:r>
-        <w:rPr>
-          <w:color w:val="7A3E9D"/>
-        </w:rPr>
-        <w:t>minor_children</w:t>
-      </w:r>
-      <w:r>
-        <w:t xml:space="preserve"> </w:t>
-      </w:r>
-      <w:r>
-        <w:rPr>
-          <w:color w:val="4B69C6"/>
-        </w:rPr>
-        <w:t>else</w:t>
-      </w:r>
-      <w:r>
-        <w:t xml:space="preserve"> </w:t>
-      </w:r>
-      <w:r>
-        <w:rPr>
-          <w:color w:val="777777"/>
-        </w:rPr>
-        <w:t>""</w:t>
-      </w:r>
-      <w:r>
-        <w:t xml:space="preserve"> }}{{ </w:t>
-      </w:r>
-      <w:r>
-        <w:rPr>
-          <w:color w:val="777777"/>
-        </w:rPr>
-        <w:t>"</w:t>
-      </w:r>
-      <w:r>
-        <w:rPr>
-          <w:color w:val="448C27"/>
-        </w:rPr>
-        <w:t>, Parenting Plan, and child support order</w:t>
-      </w:r>
-      <w:r>
-        <w:rPr>
-          <w:color w:val="777777"/>
-        </w:rPr>
-        <w:t>"</w:t>
-      </w:r>
-      <w:r>
-        <w:t xml:space="preserve"> </w:t>
-      </w:r>
-      <w:r>
-        <w:rPr>
-          <w:color w:val="4B69C6"/>
-        </w:rPr>
-        <w:t>if</w:t>
-      </w:r>
-      <w:r>
-        <w:t xml:space="preserve"> </w:t>
-      </w:r>
-      <w:r>
-        <w:rPr>
-          <w:color w:val="4B69C6"/>
-        </w:rPr>
-        <w:t>not</w:t>
-      </w:r>
-      <w:r>
-        <w:t xml:space="preserve"> </w:t>
-      </w:r>
-      <w:r>
-        <w:rPr>
-          <w:color w:val="7A3E9D"/>
-        </w:rPr>
-        <w:t>minor_children</w:t>
-      </w:r>
-      <w:r>
-        <w:t xml:space="preserve"> </w:t>
-      </w:r>
-      <w:r>
-        <w:rPr>
-          <w:color w:val="4B69C6"/>
-        </w:rPr>
-        <w:t>and</w:t>
-      </w:r>
-      <w:r>
-        <w:t xml:space="preserve"> </w:t>
-      </w:r>
-      <w:r>
-        <w:rPr>
-          <w:color w:val="7A3E9D"/>
-        </w:rPr>
-        <w:t>wife_is_pregnant</w:t>
-      </w:r>
-      <w:r>
-        <w:t xml:space="preserve"> </w:t>
-      </w:r>
-      <w:r>
-        <w:rPr>
-          <w:color w:val="4B69C6"/>
-        </w:rPr>
-        <w:t>in</w:t>
-      </w:r>
-      <w:r>
-        <w:t xml:space="preserve"> </w:t>
-      </w:r>
-      <w:r>
-        <w:rPr>
-          <w:color w:val="777777"/>
-        </w:rPr>
-        <w:t>('</w:t>
-      </w:r>
-      <w:r>
-        <w:rPr>
-          <w:color w:val="448C27"/>
-        </w:rPr>
-        <w:t>husband</w:t>
-      </w:r>
-      <w:r>
-        <w:rPr>
-          <w:color w:val="777777"/>
-        </w:rPr>
-        <w:t>',</w:t>
-      </w:r>
-      <w:r>
-        <w:t xml:space="preserve"> </w:t>
-      </w:r>
-      <w:r>
-        <w:rPr>
-          <w:color w:val="777777"/>
-        </w:rPr>
-        <w:t>'</w:t>
-      </w:r>
-      <w:r>
-        <w:rPr>
-          <w:color w:val="448C27"/>
-        </w:rPr>
-        <w:t>not husband</w:t>
-      </w:r>
-      <w:r>
-        <w:rPr>
-          <w:color w:val="777777"/>
-        </w:rPr>
-        <w:t>')</w:t>
-      </w:r>
-      <w:r>
-        <w:t xml:space="preserve"> </w:t>
-      </w:r>
-      <w:r>
-        <w:rPr>
-          <w:color w:val="4B69C6"/>
-        </w:rPr>
-        <w:t>else</w:t>
-      </w:r>
-      <w:r>
-        <w:t xml:space="preserve"> </w:t>
-      </w:r>
-      <w:r>
-        <w:rPr>
-          <w:color w:val="777777"/>
-        </w:rPr>
-        <w:t>""</w:t>
-      </w:r>
-      <w:r>
-        <w:t xml:space="preserve"> }}.</w:t>
+        <w:t xml:space="preserve">. The judge may end your case without hearing from you and enter a default judgment order and other orders like a </w:t>
+      </w:r>
+      <w:r>
+        <w:t>{{ "custody decree, Parenting Plan, and child support order" if user_need == 'answer custody' else "" }}{{ "divorce decree and findings of fact and conclusions of law dividing your property and debt" if user_need == 'answer divorce' else "" }}{{ ", Parenting Plan, and child support order" if minor_children else "" }}{{ ", Parenting Plan, and child support order" if not minor_children and wife_is_pregnant in ('husband', 'not husband') else "" }}</w:t>
+      </w:r>
+      <w:r>
+        <w:t>.</w:t>
       </w:r>
     </w:p>
     <w:p>
@@ -1648,55 +567,22 @@
         <w:pStyle w:val="Body"/>
       </w:pPr>
       <w:r>
-        <w:t xml:space="preserve">{% </w:t>
-      </w:r>
-      <w:r>
-        <w:rPr>
-          <w:color w:val="4B69C6"/>
-        </w:rPr>
-        <w:t>elif</w:t>
-      </w:r>
-      <w:r>
-        <w:t xml:space="preserve"> </w:t>
-      </w:r>
-      <w:r>
-        <w:rPr>
-          <w:color w:val="7A3E9D"/>
-        </w:rPr>
-        <w:t>stage_of_default</w:t>
-      </w:r>
-      <w:r>
-        <w:t xml:space="preserve"> </w:t>
-      </w:r>
-      <w:r>
-        <w:rPr>
-          <w:color w:val="777777"/>
-        </w:rPr>
-        <w:t>==</w:t>
-      </w:r>
-      <w:r>
-        <w:t xml:space="preserve"> </w:t>
-      </w:r>
-      <w:r>
-        <w:rPr>
-          <w:color w:val="777777"/>
-        </w:rPr>
-        <w:t>'</w:t>
-      </w:r>
-      <w:r>
-        <w:rPr>
-          <w:color w:val="448C27"/>
-        </w:rPr>
-        <w:t>judgment entered</w:t>
-      </w:r>
-      <w:r>
-        <w:rPr>
-          <w:color w:val="777777"/>
-        </w:rPr>
-        <w:t>'</w:t>
-      </w:r>
-      <w:r>
-        <w:t xml:space="preserve"> %}</w:t>
+        <w:rPr>
+          <w:color w:val="FFC000"/>
+        </w:rPr>
+        <w:t>{%</w:t>
+      </w:r>
+      <w:r>
+        <w:rPr>
+          <w:color w:val="FFC000"/>
+        </w:rPr>
+        <w:t>p</w:t>
+      </w:r>
+      <w:r>
+        <w:rPr>
+          <w:color w:val="FFC000"/>
+        </w:rPr>
+        <w:t xml:space="preserve"> elif stage_of_default == 'judgment entered' %}</w:t>
       </w:r>
     </w:p>
     <w:p>
@@ -1704,373 +590,10 @@
         <w:pStyle w:val="Body"/>
       </w:pPr>
       <w:r>
-        <w:t xml:space="preserve">When a judge enters a default judgment, they usually also enter a {{ </w:t>
-      </w:r>
-      <w:r>
-        <w:rPr>
-          <w:color w:val="777777"/>
-        </w:rPr>
-        <w:t>"</w:t>
-      </w:r>
-      <w:r>
-        <w:rPr>
-          <w:color w:val="448C27"/>
-        </w:rPr>
-        <w:t>custody decree, Parenting Plan, and child support order</w:t>
-      </w:r>
-      <w:r>
-        <w:rPr>
-          <w:color w:val="777777"/>
-        </w:rPr>
-        <w:t>"</w:t>
-      </w:r>
-      <w:r>
-        <w:t xml:space="preserve"> </w:t>
-      </w:r>
-      <w:r>
-        <w:rPr>
-          <w:color w:val="4B69C6"/>
-        </w:rPr>
-        <w:t>if</w:t>
-      </w:r>
-      <w:r>
-        <w:t xml:space="preserve"> </w:t>
-      </w:r>
-      <w:r>
-        <w:rPr>
-          <w:color w:val="7A3E9D"/>
-        </w:rPr>
-        <w:t>user_need</w:t>
-      </w:r>
-      <w:r>
-        <w:t xml:space="preserve"> </w:t>
-      </w:r>
-      <w:r>
-        <w:rPr>
-          <w:color w:val="777777"/>
-        </w:rPr>
-        <w:t>==</w:t>
-      </w:r>
-      <w:r>
-        <w:t xml:space="preserve"> </w:t>
-      </w:r>
-      <w:r>
-        <w:rPr>
-          <w:color w:val="777777"/>
-        </w:rPr>
-        <w:t>'</w:t>
-      </w:r>
-      <w:r>
-        <w:rPr>
-          <w:color w:val="448C27"/>
-        </w:rPr>
-        <w:t>answer custody</w:t>
-      </w:r>
-      <w:r>
-        <w:rPr>
-          <w:color w:val="777777"/>
-        </w:rPr>
-        <w:t>'</w:t>
-      </w:r>
-      <w:r>
-        <w:t xml:space="preserve"> </w:t>
-      </w:r>
-      <w:r>
-        <w:rPr>
-          <w:color w:val="4B69C6"/>
-        </w:rPr>
-        <w:t>else</w:t>
-      </w:r>
-      <w:r>
-        <w:t xml:space="preserve"> </w:t>
-      </w:r>
-      <w:r>
-        <w:rPr>
-          <w:color w:val="777777"/>
-        </w:rPr>
-        <w:t>""</w:t>
-      </w:r>
-      <w:r>
-        <w:t xml:space="preserve"> }}{{ </w:t>
-      </w:r>
-      <w:r>
-        <w:rPr>
-          <w:color w:val="777777"/>
-        </w:rPr>
-        <w:t>"</w:t>
-      </w:r>
-      <w:r>
-        <w:rPr>
-          <w:color w:val="448C27"/>
-        </w:rPr>
-        <w:t>divorce decree and findings of fact and conclusions of law dividing your property and debt</w:t>
-      </w:r>
-      <w:r>
-        <w:rPr>
-          <w:color w:val="777777"/>
-        </w:rPr>
-        <w:t>"</w:t>
-      </w:r>
-      <w:r>
-        <w:t xml:space="preserve"> </w:t>
-      </w:r>
-      <w:r>
-        <w:rPr>
-          <w:color w:val="4B69C6"/>
-        </w:rPr>
-        <w:t>if</w:t>
-      </w:r>
-      <w:r>
-        <w:t xml:space="preserve"> </w:t>
-      </w:r>
-      <w:r>
-        <w:rPr>
-          <w:color w:val="7A3E9D"/>
-        </w:rPr>
-        <w:t>user_need</w:t>
-      </w:r>
-      <w:r>
-        <w:t xml:space="preserve"> </w:t>
-      </w:r>
-      <w:r>
-        <w:rPr>
-          <w:color w:val="777777"/>
-        </w:rPr>
-        <w:t>==</w:t>
-      </w:r>
-      <w:r>
-        <w:t xml:space="preserve"> </w:t>
-      </w:r>
-      <w:r>
-        <w:rPr>
-          <w:color w:val="777777"/>
-        </w:rPr>
-        <w:t>'</w:t>
-      </w:r>
-      <w:r>
-        <w:rPr>
-          <w:color w:val="448C27"/>
-        </w:rPr>
-        <w:t>answer divorce</w:t>
-      </w:r>
-      <w:r>
-        <w:rPr>
-          <w:color w:val="777777"/>
-        </w:rPr>
-        <w:t>'</w:t>
-      </w:r>
-      <w:r>
-        <w:t xml:space="preserve"> </w:t>
-      </w:r>
-      <w:r>
-        <w:rPr>
-          <w:color w:val="4B69C6"/>
-        </w:rPr>
-        <w:t>else</w:t>
-      </w:r>
-      <w:r>
-        <w:t xml:space="preserve"> </w:t>
-      </w:r>
-      <w:r>
-        <w:rPr>
-          <w:color w:val="777777"/>
-        </w:rPr>
-        <w:t>""</w:t>
-      </w:r>
-      <w:r>
-        <w:t xml:space="preserve"> }}{{ </w:t>
-      </w:r>
-      <w:r>
-        <w:rPr>
-          <w:color w:val="777777"/>
-        </w:rPr>
-        <w:t>"</w:t>
-      </w:r>
-      <w:r>
-        <w:rPr>
-          <w:color w:val="448C27"/>
-        </w:rPr>
-        <w:t>, Parenting Plan, and child support order</w:t>
-      </w:r>
-      <w:r>
-        <w:rPr>
-          <w:color w:val="777777"/>
-        </w:rPr>
-        <w:t>"</w:t>
-      </w:r>
-      <w:r>
-        <w:t xml:space="preserve"> </w:t>
-      </w:r>
-      <w:r>
-        <w:rPr>
-          <w:color w:val="4B69C6"/>
-        </w:rPr>
-        <w:t>if</w:t>
-      </w:r>
-      <w:r>
-        <w:t xml:space="preserve"> </w:t>
-      </w:r>
-      <w:r>
-        <w:rPr>
-          <w:color w:val="7A3E9D"/>
-        </w:rPr>
-        <w:t>minor_children</w:t>
-      </w:r>
-      <w:r>
-        <w:t xml:space="preserve"> </w:t>
-      </w:r>
-      <w:r>
-        <w:rPr>
-          <w:color w:val="4B69C6"/>
-        </w:rPr>
-        <w:t>else</w:t>
-      </w:r>
-      <w:r>
-        <w:t xml:space="preserve"> </w:t>
-      </w:r>
-      <w:r>
-        <w:rPr>
-          <w:color w:val="777777"/>
-        </w:rPr>
-        <w:t>""</w:t>
-      </w:r>
-      <w:r>
-        <w:t xml:space="preserve"> }}{{ </w:t>
-      </w:r>
-      <w:r>
-        <w:rPr>
-          <w:color w:val="777777"/>
-        </w:rPr>
-        <w:t>"</w:t>
-      </w:r>
-      <w:r>
-        <w:rPr>
-          <w:color w:val="448C27"/>
-        </w:rPr>
-        <w:t>, Parenting Plan, and child support order</w:t>
-      </w:r>
-      <w:r>
-        <w:rPr>
-          <w:color w:val="777777"/>
-        </w:rPr>
-        <w:t>"</w:t>
-      </w:r>
-      <w:r>
-        <w:t xml:space="preserve"> </w:t>
-      </w:r>
-      <w:r>
-        <w:rPr>
-          <w:color w:val="4B69C6"/>
-        </w:rPr>
-        <w:t>if</w:t>
-      </w:r>
-      <w:r>
-        <w:t xml:space="preserve"> </w:t>
-      </w:r>
-      <w:r>
-        <w:rPr>
-          <w:color w:val="4B69C6"/>
-        </w:rPr>
-        <w:t>not</w:t>
-      </w:r>
-      <w:r>
-        <w:t xml:space="preserve"> </w:t>
-      </w:r>
-      <w:r>
-        <w:rPr>
-          <w:color w:val="7A3E9D"/>
-        </w:rPr>
-        <w:t>minor_children</w:t>
-      </w:r>
-      <w:r>
-        <w:t xml:space="preserve"> </w:t>
-      </w:r>
-      <w:r>
-        <w:rPr>
-          <w:color w:val="4B69C6"/>
-        </w:rPr>
-        <w:t>and</w:t>
-      </w:r>
-      <w:r>
-        <w:t xml:space="preserve"> </w:t>
-      </w:r>
-      <w:r>
-        <w:rPr>
-          <w:color w:val="7A3E9D"/>
-        </w:rPr>
-        <w:t>wife_is_pregnant</w:t>
-      </w:r>
-      <w:r>
-        <w:t xml:space="preserve"> </w:t>
-      </w:r>
-      <w:r>
-        <w:rPr>
-          <w:color w:val="4B69C6"/>
-        </w:rPr>
-        <w:t>in</w:t>
-      </w:r>
-      <w:r>
-        <w:t xml:space="preserve"> </w:t>
-      </w:r>
-      <w:r>
-        <w:rPr>
-          <w:color w:val="777777"/>
-        </w:rPr>
-        <w:t>('</w:t>
-      </w:r>
-      <w:r>
-        <w:rPr>
-          <w:color w:val="448C27"/>
-        </w:rPr>
-        <w:t>husband</w:t>
-      </w:r>
-      <w:r>
-        <w:rPr>
-          <w:color w:val="777777"/>
-        </w:rPr>
-        <w:t>',</w:t>
-      </w:r>
-      <w:r>
-        <w:t xml:space="preserve"> </w:t>
-      </w:r>
-      <w:r>
-        <w:rPr>
-          <w:color w:val="777777"/>
-        </w:rPr>
-        <w:t>'</w:t>
-      </w:r>
-      <w:r>
-        <w:rPr>
-          <w:color w:val="448C27"/>
-        </w:rPr>
-        <w:t>not husband</w:t>
-      </w:r>
-      <w:r>
-        <w:rPr>
-          <w:color w:val="777777"/>
-        </w:rPr>
-        <w:t>')</w:t>
-      </w:r>
-      <w:r>
-        <w:t xml:space="preserve"> </w:t>
-      </w:r>
-      <w:r>
-        <w:rPr>
-          <w:color w:val="4B69C6"/>
-        </w:rPr>
-        <w:t>else</w:t>
-      </w:r>
-      <w:r>
-        <w:t xml:space="preserve"> </w:t>
-      </w:r>
-      <w:r>
-        <w:rPr>
-          <w:color w:val="777777"/>
-        </w:rPr>
-        <w:t>""</w:t>
-      </w:r>
-      <w:r>
-        <w:t xml:space="preserve"> }}.</w:t>
+        <w:t xml:space="preserve">When a judge enters a default judgment, they usually also enter a </w:t>
+      </w:r>
+      <w:r>
+        <w:t>{{ "custody decree, Parenting Plan, and child support order" if user_need == 'answer custody' else "" }}{{ "divorce decree and findings of fact and conclusions of law dividing your property and debt" if user_need == 'answer divorce' else "" }}{{ ", Parenting Plan, and child support order" if minor_children else "" }}{{ ", Parenting Plan, and child support order" if not minor_children and wife_is_pregnant in ('husband', 'not husband') else "" }}.</w:t>
       </w:r>
     </w:p>
     <w:p>
@@ -2078,16 +601,22 @@
         <w:pStyle w:val="Body"/>
       </w:pPr>
       <w:r>
-        <w:t xml:space="preserve">{% </w:t>
-      </w:r>
-      <w:r>
-        <w:rPr>
-          <w:color w:val="4B69C6"/>
-        </w:rPr>
-        <w:t>endif</w:t>
-      </w:r>
-      <w:r>
-        <w:t xml:space="preserve"> %}</w:t>
+        <w:rPr>
+          <w:color w:val="FFC000"/>
+        </w:rPr>
+        <w:t>{%</w:t>
+      </w:r>
+      <w:r>
+        <w:rPr>
+          <w:color w:val="FFC000"/>
+        </w:rPr>
+        <w:t>p</w:t>
+      </w:r>
+      <w:r>
+        <w:rPr>
+          <w:color w:val="FFC000"/>
+        </w:rPr>
+        <w:t xml:space="preserve"> endif %}</w:t>
       </w:r>
     </w:p>
     <w:p>
@@ -2103,91 +632,22 @@
         <w:pStyle w:val="Body"/>
       </w:pPr>
       <w:r>
-        <w:t xml:space="preserve">{% </w:t>
-      </w:r>
-      <w:r>
-        <w:rPr>
-          <w:color w:val="4B69C6"/>
-        </w:rPr>
-        <w:t>if</w:t>
-      </w:r>
-      <w:r>
-        <w:t xml:space="preserve"> </w:t>
-      </w:r>
-      <w:r>
-        <w:rPr>
-          <w:color w:val="7A3E9D"/>
-        </w:rPr>
-        <w:t>type_of_response</w:t>
-      </w:r>
-      <w:r>
-        <w:rPr>
-          <w:color w:val="777777"/>
-        </w:rPr>
-        <w:t>['</w:t>
-      </w:r>
-      <w:r>
-        <w:rPr>
-          <w:color w:val="448C27"/>
-        </w:rPr>
-        <w:t>case in 2 states</w:t>
-      </w:r>
-      <w:r>
-        <w:rPr>
-          <w:color w:val="777777"/>
-        </w:rPr>
-        <w:t>']</w:t>
-      </w:r>
-      <w:r>
-        <w:t xml:space="preserve"> </w:t>
-      </w:r>
-      <w:r>
-        <w:rPr>
-          <w:color w:val="4B69C6"/>
-        </w:rPr>
-        <w:t>and</w:t>
-      </w:r>
-      <w:r>
-        <w:t xml:space="preserve"> </w:t>
-      </w:r>
-      <w:r>
-        <w:rPr>
-          <w:color w:val="7A3E9D"/>
-        </w:rPr>
-        <w:t>stage_of_other_case</w:t>
-      </w:r>
-      <w:r>
-        <w:t xml:space="preserve"> </w:t>
-      </w:r>
-      <w:r>
-        <w:rPr>
-          <w:color w:val="777777"/>
-        </w:rPr>
-        <w:t>==</w:t>
-      </w:r>
-      <w:r>
-        <w:t xml:space="preserve"> </w:t>
-      </w:r>
-      <w:r>
-        <w:rPr>
-          <w:color w:val="777777"/>
-        </w:rPr>
-        <w:t>'</w:t>
-      </w:r>
-      <w:r>
-        <w:rPr>
-          <w:color w:val="448C27"/>
-        </w:rPr>
-        <w:t>still going</w:t>
-      </w:r>
-      <w:r>
-        <w:rPr>
-          <w:color w:val="777777"/>
-        </w:rPr>
-        <w:t>'</w:t>
-      </w:r>
-      <w:r>
-        <w:t xml:space="preserve"> %}</w:t>
+        <w:rPr>
+          <w:color w:val="FFC000"/>
+        </w:rPr>
+        <w:t>{%</w:t>
+      </w:r>
+      <w:r>
+        <w:rPr>
+          <w:color w:val="FFC000"/>
+        </w:rPr>
+        <w:t>p</w:t>
+      </w:r>
+      <w:r>
+        <w:rPr>
+          <w:color w:val="FFC000"/>
+        </w:rPr>
+        <w:t xml:space="preserve"> if type_of_response['case in 2 states'] and stage_of_other_case == 'still going' %}</w:t>
       </w:r>
     </w:p>
     <w:p>
@@ -2195,7 +655,19 @@
         <w:pStyle w:val="Body"/>
       </w:pPr>
       <w:r>
-        <w:t>If you have final orders in your Alaska case and an open case in another state, your situation is complicated. You should [talk to a lawyer](https://courts.alaska.gov/shc/shclawyer.htm) and let both courts know there are 2 cases going on.</w:t>
+        <w:t xml:space="preserve">If you have final orders in your Alaska case and an open case in another state, your situation is complicated. You should </w:t>
+      </w:r>
+      <w:hyperlink r:id="rId7" w:history="1">
+        <w:r>
+          <w:rPr>
+            <w:rStyle w:val="Hyperlink"/>
+            <w:spacing w:val="0"/>
+          </w:rPr>
+          <w:t>talk to a lawyer</w:t>
+        </w:r>
+      </w:hyperlink>
+      <w:r>
+        <w:t xml:space="preserve"> and let both courts know there are 2 cases going on.</w:t>
       </w:r>
     </w:p>
     <w:p>
@@ -2203,6 +675,7 @@
         <w:pStyle w:val="Body"/>
       </w:pPr>
       <w:r>
+        <w:lastRenderedPageBreak/>
         <w:t xml:space="preserve">If you want to ask the Alaska judge to undo the orders in your Alaska case you can file a </w:t>
       </w:r>
       <w:r>
@@ -2220,16 +693,22 @@
         <w:pStyle w:val="Body"/>
       </w:pPr>
       <w:r>
-        <w:t xml:space="preserve">{% </w:t>
-      </w:r>
-      <w:r>
-        <w:rPr>
-          <w:color w:val="4B69C6"/>
-        </w:rPr>
-        <w:t>endif</w:t>
-      </w:r>
-      <w:r>
-        <w:t xml:space="preserve"> %}</w:t>
+        <w:rPr>
+          <w:color w:val="FFC000"/>
+        </w:rPr>
+        <w:t>{%</w:t>
+      </w:r>
+      <w:r>
+        <w:rPr>
+          <w:color w:val="FFC000"/>
+        </w:rPr>
+        <w:t>p</w:t>
+      </w:r>
+      <w:r>
+        <w:rPr>
+          <w:color w:val="FFC000"/>
+        </w:rPr>
+        <w:t xml:space="preserve"> endif %}</w:t>
       </w:r>
     </w:p>
     <w:p>
@@ -2237,16 +716,22 @@
         <w:pStyle w:val="Body"/>
       </w:pPr>
       <w:r>
-        <w:t xml:space="preserve">{% </w:t>
-      </w:r>
-      <w:r>
-        <w:rPr>
-          <w:color w:val="4B69C6"/>
-        </w:rPr>
-        <w:t>endif</w:t>
-      </w:r>
-      <w:r>
-        <w:t xml:space="preserve"> %}</w:t>
+        <w:rPr>
+          <w:color w:val="FF0000"/>
+        </w:rPr>
+        <w:t>{%</w:t>
+      </w:r>
+      <w:r>
+        <w:rPr>
+          <w:color w:val="FF0000"/>
+        </w:rPr>
+        <w:t>p</w:t>
+      </w:r>
+      <w:r>
+        <w:rPr>
+          <w:color w:val="FF0000"/>
+        </w:rPr>
+        <w:t xml:space="preserve"> endif %}</w:t>
       </w:r>
     </w:p>
     <w:p>
@@ -2254,25 +739,22 @@
         <w:pStyle w:val="Body"/>
       </w:pPr>
       <w:r>
-        <w:t xml:space="preserve">{% </w:t>
-      </w:r>
-      <w:r>
-        <w:rPr>
-          <w:color w:val="4B69C6"/>
-        </w:rPr>
-        <w:t>if</w:t>
-      </w:r>
-      <w:r>
-        <w:t xml:space="preserve"> </w:t>
-      </w:r>
-      <w:r>
-        <w:rPr>
-          <w:color w:val="7A3E9D"/>
-        </w:rPr>
-        <w:t>military</w:t>
-      </w:r>
-      <w:r>
-        <w:t xml:space="preserve"> %}</w:t>
+        <w:rPr>
+          <w:color w:val="FF0000"/>
+        </w:rPr>
+        <w:t>{%</w:t>
+      </w:r>
+      <w:r>
+        <w:rPr>
+          <w:color w:val="FF0000"/>
+        </w:rPr>
+        <w:t>p</w:t>
+      </w:r>
+      <w:r>
+        <w:rPr>
+          <w:color w:val="FF0000"/>
+        </w:rPr>
+        <w:t xml:space="preserve"> if military %}</w:t>
       </w:r>
     </w:p>
     <w:p>
@@ -2299,7 +781,7 @@
       <w:r>
         <w:t xml:space="preserve">, you may have some protections against default judgment if the case is filed while you were on active duty. You can learn more about the </w:t>
       </w:r>
-      <w:hyperlink r:id="rId7" w:history="1">
+      <w:hyperlink r:id="rId8" w:history="1">
         <w:r>
           <w:rPr>
             <w:rStyle w:val="Hyperlink"/>
@@ -2311,7 +793,7 @@
       <w:r>
         <w:t xml:space="preserve"> on the federal website, </w:t>
       </w:r>
-      <w:hyperlink r:id="rId8" w:history="1">
+      <w:hyperlink r:id="rId9" w:history="1">
         <w:r>
           <w:rPr>
             <w:rStyle w:val="Hyperlink"/>
@@ -2329,740 +811,22 @@
         <w:pStyle w:val="Body"/>
       </w:pPr>
       <w:r>
-        <w:lastRenderedPageBreak/>
-        <w:t xml:space="preserve">{% </w:t>
-      </w:r>
-      <w:r>
-        <w:rPr>
-          <w:color w:val="4B69C6"/>
-        </w:rPr>
-        <w:t>if</w:t>
-      </w:r>
-      <w:r>
-        <w:t xml:space="preserve"> </w:t>
-      </w:r>
-      <w:r>
-        <w:rPr>
-          <w:color w:val="7A3E9D"/>
-        </w:rPr>
-        <w:t>type_of_response</w:t>
-      </w:r>
-      <w:r>
-        <w:rPr>
-          <w:color w:val="777777"/>
-        </w:rPr>
-        <w:t>.</w:t>
-      </w:r>
-      <w:r>
-        <w:rPr>
-          <w:color w:val="7A3E9D"/>
-        </w:rPr>
-        <w:t>all_true</w:t>
-      </w:r>
-      <w:r>
-        <w:rPr>
-          <w:color w:val="777777"/>
-        </w:rPr>
-        <w:t>('</w:t>
-      </w:r>
-      <w:r>
-        <w:rPr>
-          <w:color w:val="448C27"/>
-        </w:rPr>
-        <w:t>default</w:t>
-      </w:r>
-      <w:r>
-        <w:rPr>
-          <w:color w:val="777777"/>
-        </w:rPr>
-        <w:t>',</w:t>
-      </w:r>
-      <w:r>
-        <w:t xml:space="preserve"> </w:t>
-      </w:r>
-      <w:r>
-        <w:rPr>
-          <w:color w:val="7A3E9D"/>
-        </w:rPr>
-        <w:t>exclusive</w:t>
-      </w:r>
-      <w:r>
-        <w:t xml:space="preserve"> </w:t>
-      </w:r>
-      <w:r>
-        <w:rPr>
-          <w:color w:val="777777"/>
-        </w:rPr>
-        <w:t>=</w:t>
-      </w:r>
-      <w:r>
-        <w:t xml:space="preserve"> </w:t>
-      </w:r>
-      <w:r>
-        <w:rPr>
-          <w:color w:val="7A3E9D"/>
-        </w:rPr>
-        <w:t>True</w:t>
-      </w:r>
-      <w:r>
-        <w:rPr>
-          <w:color w:val="777777"/>
-        </w:rPr>
-        <w:t>)</w:t>
-      </w:r>
-      <w:r>
-        <w:t xml:space="preserve"> </w:t>
-      </w:r>
-      <w:r>
-        <w:rPr>
-          <w:color w:val="4B69C6"/>
-        </w:rPr>
-        <w:t>or</w:t>
-      </w:r>
-      <w:r>
-        <w:t xml:space="preserve"> </w:t>
-      </w:r>
-      <w:r>
-        <w:rPr>
-          <w:color w:val="777777"/>
-        </w:rPr>
-        <w:t>(</w:t>
-      </w:r>
-      <w:r>
-        <w:rPr>
-          <w:color w:val="7A3E9D"/>
-        </w:rPr>
-        <w:t>type_of_response</w:t>
-      </w:r>
-      <w:r>
-        <w:rPr>
-          <w:color w:val="777777"/>
-        </w:rPr>
-        <w:t>['</w:t>
-      </w:r>
-      <w:r>
-        <w:rPr>
-          <w:color w:val="448C27"/>
-        </w:rPr>
-        <w:t>default</w:t>
-      </w:r>
-      <w:r>
-        <w:rPr>
-          <w:color w:val="777777"/>
-        </w:rPr>
-        <w:t>']</w:t>
-      </w:r>
-      <w:r>
-        <w:t xml:space="preserve"> </w:t>
-      </w:r>
-      <w:r>
-        <w:rPr>
-          <w:color w:val="4B69C6"/>
-        </w:rPr>
-        <w:t>and</w:t>
-      </w:r>
-      <w:r>
-        <w:t xml:space="preserve"> </w:t>
-      </w:r>
-      <w:r>
-        <w:rPr>
-          <w:color w:val="7A3E9D"/>
-        </w:rPr>
-        <w:t>type_of_response</w:t>
-      </w:r>
-      <w:r>
-        <w:rPr>
-          <w:color w:val="777777"/>
-        </w:rPr>
-        <w:t>['</w:t>
-      </w:r>
-      <w:r>
-        <w:rPr>
-          <w:color w:val="448C27"/>
-        </w:rPr>
-        <w:t>wrong state</w:t>
-      </w:r>
-      <w:r>
-        <w:rPr>
-          <w:color w:val="777777"/>
-        </w:rPr>
-        <w:t>']</w:t>
-      </w:r>
-      <w:r>
-        <w:t xml:space="preserve"> </w:t>
-      </w:r>
-      <w:r>
-        <w:rPr>
-          <w:color w:val="4B69C6"/>
-        </w:rPr>
-        <w:t>and</w:t>
-      </w:r>
-      <w:r>
-        <w:t xml:space="preserve"> </w:t>
-      </w:r>
-      <w:r>
-        <w:rPr>
-          <w:color w:val="777777"/>
-        </w:rPr>
-        <w:t>((</w:t>
-      </w:r>
-      <w:r>
-        <w:rPr>
-          <w:color w:val="7A3E9D"/>
-        </w:rPr>
-        <w:t>user_need</w:t>
-      </w:r>
-      <w:r>
-        <w:t xml:space="preserve"> </w:t>
-      </w:r>
-      <w:r>
-        <w:rPr>
-          <w:color w:val="777777"/>
-        </w:rPr>
-        <w:t>==</w:t>
-      </w:r>
-      <w:r>
-        <w:t xml:space="preserve"> </w:t>
-      </w:r>
-      <w:r>
-        <w:rPr>
-          <w:color w:val="777777"/>
-        </w:rPr>
-        <w:t>'</w:t>
-      </w:r>
-      <w:r>
-        <w:rPr>
-          <w:color w:val="448C27"/>
-        </w:rPr>
-        <w:t>answer custody</w:t>
-      </w:r>
-      <w:r>
-        <w:rPr>
-          <w:color w:val="777777"/>
-        </w:rPr>
-        <w:t>'</w:t>
-      </w:r>
-      <w:r>
-        <w:t xml:space="preserve"> </w:t>
-      </w:r>
-      <w:r>
-        <w:rPr>
-          <w:color w:val="4B69C6"/>
-        </w:rPr>
-        <w:t>and</w:t>
-      </w:r>
-      <w:r>
-        <w:t xml:space="preserve"> </w:t>
-      </w:r>
-      <w:r>
-        <w:rPr>
-          <w:color w:val="7A3E9D"/>
-        </w:rPr>
-        <w:t>jurisdiction</w:t>
-      </w:r>
-      <w:r>
-        <w:rPr>
-          <w:color w:val="777777"/>
-        </w:rPr>
-        <w:t>)</w:t>
-      </w:r>
-      <w:r>
-        <w:t xml:space="preserve"> </w:t>
-      </w:r>
-      <w:r>
-        <w:rPr>
-          <w:color w:val="4B69C6"/>
-        </w:rPr>
-        <w:t>or</w:t>
-      </w:r>
-      <w:r>
-        <w:t xml:space="preserve"> </w:t>
-      </w:r>
-      <w:r>
-        <w:rPr>
-          <w:color w:val="7A3E9D"/>
-        </w:rPr>
-        <w:t>user_need</w:t>
-      </w:r>
-      <w:r>
-        <w:t xml:space="preserve"> </w:t>
-      </w:r>
-      <w:r>
-        <w:rPr>
-          <w:color w:val="777777"/>
-        </w:rPr>
-        <w:t>==</w:t>
-      </w:r>
-      <w:r>
-        <w:t xml:space="preserve"> </w:t>
-      </w:r>
-      <w:r>
-        <w:rPr>
-          <w:color w:val="777777"/>
-        </w:rPr>
-        <w:t>'</w:t>
-      </w:r>
-      <w:r>
-        <w:rPr>
-          <w:color w:val="448C27"/>
-        </w:rPr>
-        <w:t>answer divorce</w:t>
-      </w:r>
-      <w:r>
-        <w:rPr>
-          <w:color w:val="777777"/>
-        </w:rPr>
-        <w:t>'))</w:t>
-      </w:r>
-      <w:r>
-        <w:t xml:space="preserve"> </w:t>
-      </w:r>
-      <w:r>
-        <w:rPr>
-          <w:color w:val="4B69C6"/>
-        </w:rPr>
-        <w:t>or</w:t>
-      </w:r>
-      <w:r>
-        <w:t xml:space="preserve"> </w:t>
-      </w:r>
-      <w:r>
-        <w:rPr>
-          <w:color w:val="777777"/>
-        </w:rPr>
-        <w:t>(</w:t>
-      </w:r>
-      <w:r>
-        <w:rPr>
-          <w:color w:val="7A3E9D"/>
-        </w:rPr>
-        <w:t>type_of_response</w:t>
-      </w:r>
-      <w:r>
-        <w:rPr>
-          <w:color w:val="777777"/>
-        </w:rPr>
-        <w:t>['</w:t>
-      </w:r>
-      <w:r>
-        <w:rPr>
-          <w:color w:val="448C27"/>
-        </w:rPr>
-        <w:t>default</w:t>
-      </w:r>
-      <w:r>
-        <w:rPr>
-          <w:color w:val="777777"/>
-        </w:rPr>
-        <w:t>']</w:t>
-      </w:r>
-      <w:r>
-        <w:t xml:space="preserve"> </w:t>
-      </w:r>
-      <w:r>
-        <w:rPr>
-          <w:color w:val="4B69C6"/>
-        </w:rPr>
-        <w:t>and</w:t>
-      </w:r>
-      <w:r>
-        <w:t xml:space="preserve"> </w:t>
-      </w:r>
-      <w:r>
-        <w:rPr>
-          <w:color w:val="7A3E9D"/>
-        </w:rPr>
-        <w:t>type_of_response</w:t>
-      </w:r>
-      <w:r>
-        <w:rPr>
-          <w:color w:val="777777"/>
-        </w:rPr>
-        <w:t>['</w:t>
-      </w:r>
-      <w:r>
-        <w:rPr>
-          <w:color w:val="448C27"/>
-        </w:rPr>
-        <w:t>case in 2 states</w:t>
-      </w:r>
-      <w:r>
-        <w:rPr>
-          <w:color w:val="777777"/>
-        </w:rPr>
-        <w:t>']</w:t>
-      </w:r>
-      <w:r>
-        <w:t xml:space="preserve"> </w:t>
-      </w:r>
-      <w:r>
-        <w:rPr>
-          <w:color w:val="4B69C6"/>
-        </w:rPr>
-        <w:t>and</w:t>
-      </w:r>
-      <w:r>
-        <w:t xml:space="preserve"> </w:t>
-      </w:r>
-      <w:r>
-        <w:rPr>
-          <w:color w:val="7A3E9D"/>
-        </w:rPr>
-        <w:t>stage_of_other_case</w:t>
-      </w:r>
-      <w:r>
-        <w:t xml:space="preserve"> </w:t>
-      </w:r>
-      <w:r>
-        <w:rPr>
-          <w:color w:val="777777"/>
-        </w:rPr>
-        <w:t>==</w:t>
-      </w:r>
-      <w:r>
-        <w:t xml:space="preserve"> </w:t>
-      </w:r>
-      <w:r>
-        <w:rPr>
-          <w:color w:val="777777"/>
-        </w:rPr>
-        <w:t>'</w:t>
-      </w:r>
-      <w:r>
-        <w:rPr>
-          <w:color w:val="448C27"/>
-        </w:rPr>
-        <w:t>still going</w:t>
-      </w:r>
-      <w:r>
-        <w:rPr>
-          <w:color w:val="777777"/>
-        </w:rPr>
-        <w:t>'</w:t>
-      </w:r>
-      <w:r>
-        <w:t xml:space="preserve"> </w:t>
-      </w:r>
-      <w:r>
-        <w:rPr>
-          <w:color w:val="4B69C6"/>
-        </w:rPr>
-        <w:t>and</w:t>
-      </w:r>
-      <w:r>
-        <w:t xml:space="preserve"> </w:t>
-      </w:r>
-      <w:r>
-        <w:rPr>
-          <w:color w:val="777777"/>
-        </w:rPr>
-        <w:t>((</w:t>
-      </w:r>
-      <w:r>
-        <w:rPr>
-          <w:color w:val="7A3E9D"/>
-        </w:rPr>
-        <w:t>user_need</w:t>
-      </w:r>
-      <w:r>
-        <w:t xml:space="preserve"> </w:t>
-      </w:r>
-      <w:r>
-        <w:rPr>
-          <w:color w:val="777777"/>
-        </w:rPr>
-        <w:t>==</w:t>
-      </w:r>
-      <w:r>
-        <w:t xml:space="preserve"> </w:t>
-      </w:r>
-      <w:r>
-        <w:rPr>
-          <w:color w:val="777777"/>
-        </w:rPr>
-        <w:t>'</w:t>
-      </w:r>
-      <w:r>
-        <w:rPr>
-          <w:color w:val="448C27"/>
-        </w:rPr>
-        <w:t>answer custody</w:t>
-      </w:r>
-      <w:r>
-        <w:rPr>
-          <w:color w:val="777777"/>
-        </w:rPr>
-        <w:t>'</w:t>
-      </w:r>
-      <w:r>
-        <w:t xml:space="preserve"> </w:t>
-      </w:r>
-      <w:r>
-        <w:rPr>
-          <w:color w:val="4B69C6"/>
-        </w:rPr>
-        <w:t>and</w:t>
-      </w:r>
-      <w:r>
-        <w:t xml:space="preserve"> </w:t>
-      </w:r>
-      <w:r>
-        <w:rPr>
-          <w:color w:val="7A3E9D"/>
-        </w:rPr>
-        <w:t>jurisdiction</w:t>
-      </w:r>
-      <w:r>
-        <w:rPr>
-          <w:color w:val="777777"/>
-        </w:rPr>
-        <w:t>)</w:t>
-      </w:r>
-      <w:r>
-        <w:t xml:space="preserve"> </w:t>
-      </w:r>
-      <w:r>
-        <w:rPr>
-          <w:color w:val="4B69C6"/>
-        </w:rPr>
-        <w:t>or</w:t>
-      </w:r>
-      <w:r>
-        <w:t xml:space="preserve"> </w:t>
-      </w:r>
-      <w:r>
-        <w:rPr>
-          <w:color w:val="7A3E9D"/>
-        </w:rPr>
-        <w:t>user_need</w:t>
-      </w:r>
-      <w:r>
-        <w:t xml:space="preserve"> </w:t>
-      </w:r>
-      <w:r>
-        <w:rPr>
-          <w:color w:val="777777"/>
-        </w:rPr>
-        <w:t>==</w:t>
-      </w:r>
-      <w:r>
-        <w:t xml:space="preserve"> </w:t>
-      </w:r>
-      <w:r>
-        <w:rPr>
-          <w:color w:val="777777"/>
-        </w:rPr>
-        <w:t>'</w:t>
-      </w:r>
-      <w:r>
-        <w:rPr>
-          <w:color w:val="448C27"/>
-        </w:rPr>
-        <w:t>answer divorce</w:t>
-      </w:r>
-      <w:r>
-        <w:rPr>
-          <w:color w:val="777777"/>
-        </w:rPr>
-        <w:t>')</w:t>
-      </w:r>
-      <w:r>
-        <w:t xml:space="preserve"> </w:t>
-      </w:r>
-      <w:r>
-        <w:rPr>
-          <w:color w:val="4B69C6"/>
-        </w:rPr>
-        <w:t>and</w:t>
-      </w:r>
-      <w:r>
-        <w:t xml:space="preserve"> </w:t>
-      </w:r>
-      <w:r>
-        <w:rPr>
-          <w:color w:val="7A3E9D"/>
-        </w:rPr>
-        <w:t>stage_of_default</w:t>
-      </w:r>
-      <w:r>
-        <w:t xml:space="preserve"> </w:t>
-      </w:r>
-      <w:r>
-        <w:rPr>
-          <w:color w:val="4B69C6"/>
-        </w:rPr>
-        <w:t>in</w:t>
-      </w:r>
-      <w:r>
-        <w:t xml:space="preserve"> </w:t>
-      </w:r>
-      <w:r>
-        <w:rPr>
-          <w:color w:val="777777"/>
-        </w:rPr>
-        <w:t>('</w:t>
-      </w:r>
-      <w:r>
-        <w:rPr>
-          <w:color w:val="448C27"/>
-        </w:rPr>
-        <w:t>application filed</w:t>
-      </w:r>
-      <w:r>
-        <w:rPr>
-          <w:color w:val="777777"/>
-        </w:rPr>
-        <w:t>',</w:t>
-      </w:r>
-      <w:r>
-        <w:t xml:space="preserve"> </w:t>
-      </w:r>
-      <w:r>
-        <w:rPr>
-          <w:color w:val="777777"/>
-        </w:rPr>
-        <w:t>'</w:t>
-      </w:r>
-      <w:r>
-        <w:rPr>
-          <w:color w:val="448C27"/>
-        </w:rPr>
-        <w:t>hearing scheduled</w:t>
-      </w:r>
-      <w:r>
-        <w:rPr>
-          <w:color w:val="777777"/>
-        </w:rPr>
-        <w:t>'))</w:t>
-      </w:r>
-      <w:r>
-        <w:t xml:space="preserve"> </w:t>
-      </w:r>
-      <w:r>
-        <w:rPr>
-          <w:color w:val="4B69C6"/>
-        </w:rPr>
-        <w:t>or</w:t>
-      </w:r>
-      <w:r>
-        <w:t xml:space="preserve"> </w:t>
-      </w:r>
-      <w:r>
-        <w:rPr>
-          <w:color w:val="777777"/>
-        </w:rPr>
-        <w:t>(</w:t>
-      </w:r>
-      <w:r>
-        <w:rPr>
-          <w:color w:val="7A3E9D"/>
-        </w:rPr>
-        <w:t>type_of_response</w:t>
-      </w:r>
-      <w:r>
-        <w:rPr>
-          <w:color w:val="777777"/>
-        </w:rPr>
-        <w:t>['</w:t>
-      </w:r>
-      <w:r>
-        <w:rPr>
-          <w:color w:val="448C27"/>
-        </w:rPr>
-        <w:t>default</w:t>
-      </w:r>
-      <w:r>
-        <w:rPr>
-          <w:color w:val="777777"/>
-        </w:rPr>
-        <w:t>']</w:t>
-      </w:r>
-      <w:r>
-        <w:t xml:space="preserve"> </w:t>
-      </w:r>
-      <w:r>
-        <w:rPr>
-          <w:color w:val="4B69C6"/>
-        </w:rPr>
-        <w:t>and</w:t>
-      </w:r>
-      <w:r>
-        <w:t xml:space="preserve"> </w:t>
-      </w:r>
-      <w:r>
-        <w:rPr>
-          <w:color w:val="7A3E9D"/>
-        </w:rPr>
-        <w:t>type_of_response</w:t>
-      </w:r>
-      <w:r>
-        <w:rPr>
-          <w:color w:val="777777"/>
-        </w:rPr>
-        <w:t>['</w:t>
-      </w:r>
-      <w:r>
-        <w:rPr>
-          <w:color w:val="448C27"/>
-        </w:rPr>
-        <w:t>case in 2 states</w:t>
-      </w:r>
-      <w:r>
-        <w:rPr>
-          <w:color w:val="777777"/>
-        </w:rPr>
-        <w:t>']</w:t>
-      </w:r>
-      <w:r>
-        <w:t xml:space="preserve"> </w:t>
-      </w:r>
-      <w:r>
-        <w:rPr>
-          <w:color w:val="4B69C6"/>
-        </w:rPr>
-        <w:t>and</w:t>
-      </w:r>
-      <w:r>
-        <w:t xml:space="preserve"> </w:t>
-      </w:r>
-      <w:r>
-        <w:rPr>
-          <w:color w:val="7A3E9D"/>
-        </w:rPr>
-        <w:t>stage_of_other_case</w:t>
-      </w:r>
-      <w:r>
-        <w:t xml:space="preserve"> </w:t>
-      </w:r>
-      <w:r>
-        <w:rPr>
-          <w:color w:val="777777"/>
-        </w:rPr>
-        <w:t>==</w:t>
-      </w:r>
-      <w:r>
-        <w:t xml:space="preserve"> </w:t>
-      </w:r>
-      <w:r>
-        <w:rPr>
-          <w:color w:val="777777"/>
-        </w:rPr>
-        <w:t>'</w:t>
-      </w:r>
-      <w:r>
-        <w:rPr>
-          <w:color w:val="448C27"/>
-        </w:rPr>
-        <w:t>ended with no order</w:t>
-      </w:r>
-      <w:r>
-        <w:rPr>
-          <w:color w:val="777777"/>
-        </w:rPr>
-        <w:t>')</w:t>
-      </w:r>
-      <w:r>
-        <w:t xml:space="preserve"> %}</w:t>
+        <w:rPr>
+          <w:color w:val="FFC000"/>
+        </w:rPr>
+        <w:t>{%</w:t>
+      </w:r>
+      <w:r>
+        <w:rPr>
+          <w:color w:val="FFC000"/>
+        </w:rPr>
+        <w:t>p</w:t>
+      </w:r>
+      <w:r>
+        <w:rPr>
+          <w:color w:val="FFC000"/>
+        </w:rPr>
+        <w:t xml:space="preserve"> if type_of_response.all_true('default', exclusive = True) or (type_of_response['default'] and type_of_response['wrong state'] and ((user_need == 'answer custody' and jurisdiction) or user_need == 'answer divorce')) or (type_of_response['default'] and type_of_response['case in 2 states'] and stage_of_other_case == 'still going' and ((user_need == 'answer custody' and jurisdiction) or user_need == 'answer divorce') and stage_of_default in ('application filed', 'hearing scheduled')) or (type_of_response['default'] and type_of_response['case in 2 states'] and stage_of_other_case == 'ended with no order') %}</w:t>
       </w:r>
     </w:p>
     <w:p>
@@ -3087,16 +851,22 @@
         <w:pStyle w:val="Body"/>
       </w:pPr>
       <w:r>
-        <w:t xml:space="preserve">{% </w:t>
-      </w:r>
-      <w:r>
-        <w:rPr>
-          <w:color w:val="4B69C6"/>
-        </w:rPr>
-        <w:t>endif</w:t>
-      </w:r>
-      <w:r>
-        <w:t xml:space="preserve"> %}</w:t>
+        <w:rPr>
+          <w:color w:val="FFC000"/>
+        </w:rPr>
+        <w:t>{%</w:t>
+      </w:r>
+      <w:r>
+        <w:rPr>
+          <w:color w:val="FFC000"/>
+        </w:rPr>
+        <w:t>p</w:t>
+      </w:r>
+      <w:r>
+        <w:rPr>
+          <w:color w:val="FFC000"/>
+        </w:rPr>
+        <w:t xml:space="preserve"> endif %}</w:t>
       </w:r>
     </w:p>
     <w:p>
@@ -3104,16 +874,22 @@
         <w:pStyle w:val="Body"/>
       </w:pPr>
       <w:r>
-        <w:t xml:space="preserve">{% </w:t>
-      </w:r>
-      <w:r>
-        <w:rPr>
-          <w:color w:val="4B69C6"/>
-        </w:rPr>
-        <w:t>endif</w:t>
-      </w:r>
-      <w:r>
-        <w:t xml:space="preserve"> %}</w:t>
+        <w:rPr>
+          <w:color w:val="FF0000"/>
+        </w:rPr>
+        <w:t>{%</w:t>
+      </w:r>
+      <w:r>
+        <w:rPr>
+          <w:color w:val="FF0000"/>
+        </w:rPr>
+        <w:t>p</w:t>
+      </w:r>
+      <w:r>
+        <w:rPr>
+          <w:color w:val="FF0000"/>
+        </w:rPr>
+        <w:t xml:space="preserve"> endif %}</w:t>
       </w:r>
     </w:p>
     <w:p>
@@ -3121,74 +897,36 @@
         <w:pStyle w:val="Body"/>
       </w:pPr>
       <w:r>
-        <w:t>{%p id military %}</w:t>
+        <w:rPr>
+          <w:color w:val="FF0000"/>
+        </w:rPr>
+        <w:t>{%p if (type_of_response.all_true('improper service', exclusive = True) or (type_of_response.all_false('default') and type_of_response['improper service'] and not proper_service) or (type_of_response['default'] and stage_of_default in ('application filed', 'hearing scheduled') and not proper_service)) or military%}</w:t>
       </w:r>
     </w:p>
     <w:p>
       <w:pPr>
-        <w:pStyle w:val="Body"/>
-      </w:pPr>
-      <w:r>
-        <w:t>{%</w:t>
-      </w:r>
-      <w:r>
-        <w:t xml:space="preserve">p </w:t>
-      </w:r>
-      <w:r>
-        <w:t xml:space="preserve">if </w:t>
-      </w:r>
-      <w:r>
-        <w:t>(</w:t>
-      </w:r>
-      <w:r>
-        <w:t>type_of_response.all_true('improper service', exclusive = True) or (type_of_response.all_false('default') and type_of_response['improper service'] and not proper_service) or (type_of_response['default'] and stage_of_default in ('application filed', 'hearing scheduled') and not proper_service)</w:t>
-      </w:r>
-      <w:r>
-        <w:t>)</w:t>
-      </w:r>
-      <w:r>
-        <w:t xml:space="preserve"> </w:t>
-      </w:r>
-      <w:r>
-        <w:t>or military</w:t>
-      </w:r>
-      <w:r>
-        <w:t>%}</w:t>
+        <w:pStyle w:val="Heading3"/>
+      </w:pPr>
+      <w:r>
+        <w:t>Links in this step</w:t>
       </w:r>
     </w:p>
     <w:p>
       <w:pPr>
-        <w:pStyle w:val="Heading3"/>
-      </w:pPr>
-      <w:r>
-        <w:t>Links in this step</w:t>
+        <w:pStyle w:val="Body"/>
+      </w:pPr>
+      <w:r>
+        <w:rPr>
+          <w:color w:val="FFC000"/>
+        </w:rPr>
+        <w:t>{%p if type_of_response.all_true('improper service', exclusive = True) or (type_of_response.all_false('default') and type_of_response['improper service'] and not proper_service) or (type_of_response['default'] and stage_of_default in ('application filed', 'hearing scheduled') and not proper_service) %}</w:t>
       </w:r>
     </w:p>
     <w:p>
       <w:pPr>
         <w:pStyle w:val="Body"/>
       </w:pPr>
-      <w:r>
-        <w:t>{%</w:t>
-      </w:r>
-      <w:r>
-        <w:t xml:space="preserve">p </w:t>
-      </w:r>
-      <w:r>
-        <w:t>if type_of_response.all_true('improper service', exclusive = True) or (type_of_response.all_false('default') and type_of_response['improper service'] and not proper_service) or (type_of_response['default'] and stage_of_default in ('application filed', 'hearing scheduled') and not proper_service)</w:t>
-      </w:r>
-      <w:r>
-        <w:t xml:space="preserve"> </w:t>
-      </w:r>
-      <w:r>
-        <w:t>%}</w:t>
-      </w:r>
-    </w:p>
-    <w:p>
-      <w:pPr>
-        <w:pStyle w:val="Body"/>
-      </w:pPr>
-      <w:hyperlink r:id="rId9" w:history="1">
+      <w:hyperlink r:id="rId10" w:history="1">
         <w:r>
           <w:rPr>
             <w:rStyle w:val="Hyperlink"/>
@@ -3204,7 +942,7 @@
         </w:rPr>
         <w:br/>
       </w:r>
-      <w:hyperlink r:id="rId10" w:history="1">
+      <w:hyperlink r:id="rId11" w:history="1">
         <w:r>
           <w:rPr>
             <w:rStyle w:val="Hyperlink"/>
@@ -3228,6 +966,9 @@
         <w:pStyle w:val="Body"/>
       </w:pPr>
       <w:r>
+        <w:rPr>
+          <w:color w:val="FFC000"/>
+        </w:rPr>
         <w:t>{%p endif %}</w:t>
       </w:r>
     </w:p>
@@ -3236,6 +977,9 @@
         <w:pStyle w:val="Body"/>
       </w:pPr>
       <w:r>
+        <w:rPr>
+          <w:color w:val="FFC000"/>
+        </w:rPr>
         <w:t>{%p if military %}</w:t>
       </w:r>
     </w:p>
@@ -3243,7 +987,7 @@
       <w:pPr>
         <w:pStyle w:val="Body"/>
       </w:pPr>
-      <w:hyperlink r:id="rId11" w:history="1">
+      <w:hyperlink r:id="rId12" w:history="1">
         <w:r>
           <w:rPr>
             <w:rStyle w:val="Hyperlink"/>
@@ -3255,7 +999,7 @@
       <w:r>
         <w:br/>
       </w:r>
-      <w:hyperlink r:id="rId12" w:history="1">
+      <w:hyperlink r:id="rId13" w:history="1">
         <w:r>
           <w:rPr>
             <w:rStyle w:val="Hyperlink"/>
@@ -3269,7 +1013,7 @@
       <w:pPr>
         <w:pStyle w:val="Body"/>
       </w:pPr>
-      <w:hyperlink r:id="rId13" w:history="1">
+      <w:hyperlink r:id="rId14" w:history="1">
         <w:r>
           <w:rPr>
             <w:rStyle w:val="Hyperlink"/>
@@ -3281,7 +1025,7 @@
       <w:r>
         <w:br/>
       </w:r>
-      <w:hyperlink r:id="rId14" w:history="1">
+      <w:hyperlink r:id="rId15" w:history="1">
         <w:r>
           <w:rPr>
             <w:rStyle w:val="Hyperlink"/>
@@ -3296,6 +1040,20 @@
         <w:pStyle w:val="Body"/>
       </w:pPr>
       <w:r>
+        <w:rPr>
+          <w:color w:val="FFC000"/>
+        </w:rPr>
+        <w:t>{%p endif %}</w:t>
+      </w:r>
+    </w:p>
+    <w:p>
+      <w:pPr>
+        <w:pStyle w:val="Body"/>
+      </w:pPr>
+      <w:r>
+        <w:rPr>
+          <w:color w:val="FF0000"/>
+        </w:rPr>
         <w:t>{%p endif %}</w:t>
       </w:r>
     </w:p>
@@ -6262,7 +4020,6 @@
   <w:style w:type="character" w:default="1" w:styleId="DefaultParagraphFont">
     <w:name w:val="Default Paragraph Font"/>
     <w:uiPriority w:val="1"/>
-    <w:semiHidden/>
     <w:unhideWhenUsed/>
   </w:style>
   <w:style w:type="table" w:default="1" w:styleId="TableNormal">

</xml_diff>

<commit_message>
adjusting for answering custody case
</commit_message>
<xml_diff>
--- a/docassemble/AKA2JBranding/data/templates/proper_service_content.docx
+++ b/docassemble/AKA2JBranding/data/templates/proper_service_content.docx
@@ -556,7 +556,25 @@
         <w:t xml:space="preserve">. The judge may end your case without hearing from you and enter a default judgment order and other orders like a </w:t>
       </w:r>
       <w:r>
-        <w:t>{{ "custody decree, Parenting Plan, and child support order" if user_need == 'answer custody' else "" }}{{ "divorce decree and findings of fact and conclusions of law dividing your property and debt" if user_need == 'answer divorce' else "" }}{{ ", Parenting Plan, and child support order" if minor_children else "" }}{{ ", Parenting Plan, and child support order" if not minor_children and wife_is_pregnant in ('husband', 'not husband') else "" }}</w:t>
+        <w:t xml:space="preserve">{{ "custody decree, Parenting Plan, and child support order" if user_need == 'answer custody' else "" }}{{ "divorce decree and findings of fact and conclusions of law dividing your property and debt" if user_need == 'answer divorce' else "" }}{{ ", Parenting Plan, and child support order" if </w:t>
+      </w:r>
+      <w:r>
+        <w:t>user_need == 'answer divorce'</w:t>
+      </w:r>
+      <w:r>
+        <w:t xml:space="preserve"> and </w:t>
+      </w:r>
+      <w:r>
+        <w:t xml:space="preserve">minor_children else "" }}{{ ", Parenting Plan, and child support order" if </w:t>
+      </w:r>
+      <w:r>
+        <w:t>user_need == 'answer divorce'</w:t>
+      </w:r>
+      <w:r>
+        <w:t xml:space="preserve"> and </w:t>
+      </w:r>
+      <w:r>
+        <w:t>not minor_children and wife_is_pregnant in ('husband', 'not husband') else "" }}</w:t>
       </w:r>
       <w:r>
         <w:t>.</w:t>
@@ -593,7 +611,25 @@
         <w:t xml:space="preserve">When a judge enters a default judgment, they usually also enter a </w:t>
       </w:r>
       <w:r>
-        <w:t>{{ "custody decree, Parenting Plan, and child support order" if user_need == 'answer custody' else "" }}{{ "divorce decree and findings of fact and conclusions of law dividing your property and debt" if user_need == 'answer divorce' else "" }}{{ ", Parenting Plan, and child support order" if minor_children else "" }}{{ ", Parenting Plan, and child support order" if not minor_children and wife_is_pregnant in ('husband', 'not husband') else "" }}.</w:t>
+        <w:t xml:space="preserve">{{ "custody decree, Parenting Plan, and child support order" if user_need == 'answer custody' else "" }}{{ "divorce decree and findings of fact and conclusions of law dividing your property and debt" if user_need == 'answer divorce' else "" }}{{ ", Parenting Plan, and child support order" if </w:t>
+      </w:r>
+      <w:r>
+        <w:t>user_need == 'answer divorce'</w:t>
+      </w:r>
+      <w:r>
+        <w:t xml:space="preserve"> and </w:t>
+      </w:r>
+      <w:r>
+        <w:t xml:space="preserve">minor_children else "" }}{{ ", Parenting Plan, and child support order" if </w:t>
+      </w:r>
+      <w:r>
+        <w:t>user_need == 'answer divorce'</w:t>
+      </w:r>
+      <w:r>
+        <w:t xml:space="preserve"> and </w:t>
+      </w:r>
+      <w:r>
+        <w:t>not minor_children and wife_is_pregnant in ('husband', 'not husband') else "" }}.</w:t>
       </w:r>
     </w:p>
     <w:p>
@@ -948,17 +984,8 @@
             <w:rStyle w:val="Hyperlink"/>
             <w:spacing w:val="0"/>
           </w:rPr>
-          <w:t>ak-courts.info/</w:t>
+          <w:t>ak-courts.info/courtview</w:t>
         </w:r>
-        <w:proofErr w:type="spellStart"/>
-        <w:r>
-          <w:rPr>
-            <w:rStyle w:val="Hyperlink"/>
-            <w:spacing w:val="0"/>
-          </w:rPr>
-          <w:t>courtview</w:t>
-        </w:r>
-        <w:proofErr w:type="spellEnd"/>
       </w:hyperlink>
     </w:p>
     <w:p>
@@ -4020,6 +4047,7 @@
   <w:style w:type="character" w:default="1" w:styleId="DefaultParagraphFont">
     <w:name w:val="Default Paragraph Font"/>
     <w:uiPriority w:val="1"/>
+    <w:semiHidden/>
     <w:unhideWhenUsed/>
   </w:style>
   <w:style w:type="table" w:default="1" w:styleId="TableNormal">

</xml_diff>

<commit_message>
removing sentence threatening default if you don't answer from proper service step and only asking for military if default
</commit_message>
<xml_diff>
--- a/docassemble/AKA2JBranding/data/templates/proper_service_content.docx
+++ b/docassemble/AKA2JBranding/data/templates/proper_service_content.docx
@@ -5,11 +5,14 @@
     <w:p>
       <w:pPr>
         <w:pStyle w:val="Body"/>
-      </w:pPr>
-      <w:r>
         <w:rPr>
           <w:color w:val="FF0000"/>
         </w:rPr>
+      </w:pPr>
+      <w:r>
+        <w:rPr>
+          <w:color w:val="FF0000"/>
+        </w:rPr>
         <w:t>{</w:t>
       </w:r>
       <w:r>
@@ -29,6 +32,14 @@
           <w:color w:val="FF0000"/>
         </w:rPr>
         <w:t xml:space="preserve"> if (type_of_response['improper service'] and not type_of_response['default']) or (type_of_response['default'] and not proper_service) %}</w:t>
+      </w:r>
+    </w:p>
+    <w:p>
+      <w:pPr>
+        <w:pStyle w:val="Heading3"/>
+      </w:pPr>
+      <w:r>
+        <w:t>Proper service</w:t>
       </w:r>
     </w:p>
     <w:p>
@@ -152,20 +163,6 @@
       </w:r>
       <w:r>
         <w:t xml:space="preserve"> days to file an Answer.</w:t>
-      </w:r>
-    </w:p>
-    <w:p>
-      <w:pPr>
-        <w:pStyle w:val="Body"/>
-      </w:pPr>
-      <w:r>
-        <w:t xml:space="preserve">If you do not file an Answer in 20 days, </w:t>
-      </w:r>
-      <w:r>
-        <w:t>{{ other_party_in_case }}</w:t>
-      </w:r>
-      <w:r>
-        <w:t xml:space="preserve"> may ask the court for a default judgment.</w:t>
       </w:r>
     </w:p>
     <w:p>
@@ -750,45 +747,25 @@
     <w:p>
       <w:pPr>
         <w:pStyle w:val="Body"/>
-      </w:pPr>
-      <w:r>
-        <w:rPr>
-          <w:color w:val="FF0000"/>
+        <w:rPr>
+          <w:color w:val="FFC000"/>
+        </w:rPr>
+      </w:pPr>
+      <w:r>
+        <w:rPr>
+          <w:color w:val="FFC000"/>
         </w:rPr>
         <w:t>{%</w:t>
       </w:r>
       <w:r>
         <w:rPr>
-          <w:color w:val="FF0000"/>
+          <w:color w:val="FFC000"/>
         </w:rPr>
         <w:t>p</w:t>
       </w:r>
       <w:r>
         <w:rPr>
-          <w:color w:val="FF0000"/>
-        </w:rPr>
-        <w:t xml:space="preserve"> endif %}</w:t>
-      </w:r>
-    </w:p>
-    <w:p>
-      <w:pPr>
-        <w:pStyle w:val="Body"/>
-      </w:pPr>
-      <w:r>
-        <w:rPr>
-          <w:color w:val="FF0000"/>
-        </w:rPr>
-        <w:t>{%</w:t>
-      </w:r>
-      <w:r>
-        <w:rPr>
-          <w:color w:val="FF0000"/>
-        </w:rPr>
-        <w:t>p</w:t>
-      </w:r>
-      <w:r>
-        <w:rPr>
-          <w:color w:val="FF0000"/>
+          <w:color w:val="FFC000"/>
         </w:rPr>
         <w:t xml:space="preserve"> if military %}</w:t>
       </w:r>
@@ -848,19 +825,19 @@
       </w:pPr>
       <w:r>
         <w:rPr>
-          <w:color w:val="FFC000"/>
+          <w:color w:val="92D050"/>
         </w:rPr>
         <w:t>{%</w:t>
       </w:r>
       <w:r>
         <w:rPr>
-          <w:color w:val="FFC000"/>
+          <w:color w:val="92D050"/>
         </w:rPr>
         <w:t>p</w:t>
       </w:r>
       <w:r>
         <w:rPr>
-          <w:color w:val="FFC000"/>
+          <w:color w:val="92D050"/>
         </w:rPr>
         <w:t xml:space="preserve"> if type_of_response.all_true('default', exclusive = True) or (type_of_response['default'] and type_of_response['wrong state'] and ((user_need == 'answer custody' and jurisdiction) or user_need == 'answer divorce')) or (type_of_response['default'] and type_of_response['case in 2 states'] and stage_of_other_case == 'still going' and ((user_need == 'answer custody' and jurisdiction) or user_need == 'answer divorce') and stage_of_default in ('application filed', 'hearing scheduled')) or (type_of_response['default'] and type_of_response['case in 2 states'] and stage_of_other_case == 'ended with no order') %}</w:t>
       </w:r>
@@ -880,6 +857,17 @@
       </w:r>
       <w:r>
         <w:t xml:space="preserve"> does not apply to your case to stop the default judgment, you have other options.</w:t>
+      </w:r>
+    </w:p>
+    <w:p>
+      <w:pPr>
+        <w:pStyle w:val="Body"/>
+      </w:pPr>
+      <w:r>
+        <w:rPr>
+          <w:color w:val="92D050"/>
+        </w:rPr>
+        <w:t>{%p endif %}</w:t>
       </w:r>
     </w:p>
     <w:p>
@@ -984,8 +972,17 @@
             <w:rStyle w:val="Hyperlink"/>
             <w:spacing w:val="0"/>
           </w:rPr>
-          <w:t>ak-courts.info/courtview</w:t>
+          <w:t>ak-courts.info/</w:t>
         </w:r>
+        <w:proofErr w:type="spellStart"/>
+        <w:r>
+          <w:rPr>
+            <w:rStyle w:val="Hyperlink"/>
+            <w:spacing w:val="0"/>
+          </w:rPr>
+          <w:t>courtview</w:t>
+        </w:r>
+        <w:proofErr w:type="spellEnd"/>
       </w:hyperlink>
     </w:p>
     <w:p>

</xml_diff>

<commit_message>
mostly just a stray '}' which I thought I pushed yesterday?
</commit_message>
<xml_diff>
--- a/docassemble/AKA2JBranding/data/templates/proper_service_content.docx
+++ b/docassemble/AKA2JBranding/data/templates/proper_service_content.docx
@@ -247,22 +247,7 @@
         <w:pStyle w:val="Body"/>
       </w:pPr>
       <w:r>
-        <w:rPr>
-          <w:color w:val="FF0000"/>
-        </w:rPr>
-        <w:t>{%</w:t>
-      </w:r>
-      <w:r>
-        <w:rPr>
-          <w:color w:val="FF0000"/>
-        </w:rPr>
-        <w:t>p</w:t>
-      </w:r>
-      <w:r>
-        <w:rPr>
-          <w:color w:val="FF0000"/>
-        </w:rPr>
-        <w:t xml:space="preserve"> endif %}</w:t>
+        <w:t>A default judgment is when the judge decides your case without hearing from you.</w:t>
       </w:r>
     </w:p>
     <w:p>
@@ -270,7 +255,10 @@
         <w:pStyle w:val="Body"/>
       </w:pPr>
       <w:r>
-        <w:t>A default judgment is when the judge decides your case without hearing from you.</w:t>
+        <w:rPr>
+          <w:color w:val="FF0000"/>
+        </w:rPr>
+        <w:t>{%p endif %}</w:t>
       </w:r>
     </w:p>
     <w:p>

</xml_diff>

<commit_message>
default judgment sentence in proper service needs to appear whenever default, heading only appears if default and not proper service
</commit_message>
<xml_diff>
--- a/docassemble/AKA2JBranding/data/templates/proper_service_content.docx
+++ b/docassemble/AKA2JBranding/data/templates/proper_service_content.docx
@@ -240,6 +240,55 @@
       </w:pPr>
       <w:r>
         <w:t>Default judgment</w:t>
+      </w:r>
+    </w:p>
+    <w:p>
+      <w:pPr>
+        <w:pStyle w:val="Body"/>
+      </w:pPr>
+      <w:r>
+        <w:rPr>
+          <w:color w:val="FF0000"/>
+        </w:rPr>
+        <w:t>{%p endif %}</w:t>
+      </w:r>
+    </w:p>
+    <w:p>
+      <w:pPr>
+        <w:pStyle w:val="Body"/>
+        <w:rPr>
+          <w:color w:val="FF0000"/>
+        </w:rPr>
+      </w:pPr>
+      <w:r>
+        <w:rPr>
+          <w:color w:val="FF0000"/>
+        </w:rPr>
+        <w:t>{</w:t>
+      </w:r>
+      <w:r>
+        <w:rPr>
+          <w:color w:val="FF0000"/>
+        </w:rPr>
+        <w:t>%</w:t>
+      </w:r>
+      <w:r>
+        <w:rPr>
+          <w:color w:val="FF0000"/>
+        </w:rPr>
+        <w:t>p</w:t>
+      </w:r>
+      <w:r>
+        <w:rPr>
+          <w:color w:val="FF0000"/>
+        </w:rPr>
+        <w:t xml:space="preserve"> if type_of_response['default']</w:t>
+      </w:r>
+      <w:r>
+        <w:rPr>
+          <w:color w:val="FF0000"/>
+        </w:rPr>
+        <w:t xml:space="preserve"> %}</w:t>
       </w:r>
     </w:p>
     <w:p>
@@ -334,6 +383,7 @@
         <w:rPr>
           <w:color w:val="FF0000"/>
         </w:rPr>
+        <w:lastRenderedPageBreak/>
         <w:t>{%</w:t>
       </w:r>
       <w:r>
@@ -357,7 +407,6 @@
         <w:rPr>
           <w:color w:val="FF0000"/>
         </w:rPr>
-        <w:lastRenderedPageBreak/>
         <w:t>{%</w:t>
       </w:r>
       <w:r>
@@ -676,6 +725,7 @@
         <w:pStyle w:val="Body"/>
       </w:pPr>
       <w:r>
+        <w:lastRenderedPageBreak/>
         <w:t xml:space="preserve">If you have final orders in your Alaska case and an open case in another state, your situation is complicated. You should </w:t>
       </w:r>
       <w:hyperlink r:id="rId7" w:history="1">
@@ -696,7 +746,6 @@
         <w:pStyle w:val="Body"/>
       </w:pPr>
       <w:r>
-        <w:lastRenderedPageBreak/>
         <w:t xml:space="preserve">If you want to ask the Alaska judge to undo the orders in your Alaska case you can file a </w:t>
       </w:r>
       <w:r>
@@ -981,6 +1030,7 @@
         <w:rPr>
           <w:color w:val="FFC000"/>
         </w:rPr>
+        <w:lastRenderedPageBreak/>
         <w:t>{%p endif %}</w:t>
       </w:r>
     </w:p>

</xml_diff>